<commit_message>
BRS: fix section order and numbering
Reorganised document into logical reading order:
   1  Introduction
   2  Installation (2.1 Existing-Installation Detection / FR-36)
   3  Scope
   4  Stakeholders
   5  Business Objectives
   6  Functional Requirements (6.1-6.10 incl. 6.10 Installer/FR-36)
   7  Non-Functional Requirements
   8  Constraints and Assumptions
   9  Glossary
  10  Requirements Amendments (Session 4)

Moved Glossary before Amendments, renumbered all H1 and H2 headings
sequentially, updated TOC cached entries to match new order.
Press Ctrl+A / F9 in Word to refresh TOC page numbers.

Co-Authored-By: Claude Sonnet 4.6 <noreply@anthropic.com>
</commit_message>
<xml_diff>
--- a/FileExplorer_BRS.docx
+++ b/FileExplorer_BRS.docx
@@ -114,9 +114,8 @@
       <w:pPr>
         <w:pStyle w:val="Heading1"/>
       </w:pPr>
-      <w:bookmarkStart w:id="0" w:name="_Toc232196926"/>
+      <w:bookmarkStart w:id="0" w:name="_Toc232196866"/>
       <w:r>
-        <w:lastRenderedPageBreak/>
         <w:t>Table of Contents</w:t>
       </w:r>
       <w:bookmarkEnd w:id="0"/>
@@ -124,7 +123,7 @@
     <w:sdt>
       <w:sdtPr>
         <w:alias w:val="Table of Contents"/>
-        <w:id w:val="-2093162638"/>
+        <w:id w:val="-467437297"/>
       </w:sdtPr>
       <w:sdtEndPr/>
       <w:sdtContent>
@@ -140,14 +139,10 @@
           </w:pPr>
           <w:r>
             <w:fldChar w:fldCharType="begin"/>
-          </w:r>
-          <w:r>
             <w:instrText>TOC \h \o "1-2"</w:instrText>
-          </w:r>
-          <w:r>
             <w:fldChar w:fldCharType="separate"/>
           </w:r>
-          <w:hyperlink w:anchor="_Toc232196926" w:history="1">
+          <w:hyperlink w:anchor="_Toc232196866" w:history="1">
             <w:r>
               <w:rPr>
                 <w:rStyle w:val="Hyperlink"/>
@@ -160,40 +155,10 @@
                 <w:noProof/>
               </w:rPr>
               <w:tab/>
-            </w:r>
-            <w:r>
-              <w:rPr>
-                <w:noProof/>
-              </w:rPr>
               <w:fldChar w:fldCharType="begin"/>
-            </w:r>
-            <w:r>
-              <w:rPr>
-                <w:noProof/>
-              </w:rPr>
-              <w:instrText xml:space="preserve"> PAGEREF _Toc232196926 \h </w:instrText>
-            </w:r>
-            <w:r>
-              <w:rPr>
-                <w:noProof/>
-              </w:rPr>
-            </w:r>
-            <w:r>
-              <w:rPr>
-                <w:noProof/>
-              </w:rPr>
+              <w:instrText xml:space="preserve"> PAGEREF _Toc232196866 \h </w:instrText>
               <w:fldChar w:fldCharType="separate"/>
-            </w:r>
-            <w:r>
-              <w:rPr>
-                <w:noProof/>
-              </w:rPr>
               <w:t>2</w:t>
-            </w:r>
-            <w:r>
-              <w:rPr>
-                <w:noProof/>
-              </w:rPr>
               <w:fldChar w:fldCharType="end"/>
             </w:r>
           </w:hyperlink>
@@ -208,7 +173,7 @@
               <w:noProof/>
             </w:rPr>
           </w:pPr>
-          <w:hyperlink w:anchor="_Toc232196927" w:history="1">
+          <w:hyperlink w:anchor="_Toc232196867" w:history="1">
             <w:r>
               <w:rPr>
                 <w:rStyle w:val="Hyperlink"/>
@@ -221,40 +186,10 @@
                 <w:noProof/>
               </w:rPr>
               <w:tab/>
-            </w:r>
-            <w:r>
-              <w:rPr>
-                <w:noProof/>
-              </w:rPr>
               <w:fldChar w:fldCharType="begin"/>
-            </w:r>
-            <w:r>
-              <w:rPr>
-                <w:noProof/>
-              </w:rPr>
-              <w:instrText xml:space="preserve"> PAGEREF _Toc232196927 \h </w:instrText>
-            </w:r>
-            <w:r>
-              <w:rPr>
-                <w:noProof/>
-              </w:rPr>
-            </w:r>
-            <w:r>
-              <w:rPr>
-                <w:noProof/>
-              </w:rPr>
+              <w:instrText xml:space="preserve"> PAGEREF _Toc232196867 \h </w:instrText>
               <w:fldChar w:fldCharType="separate"/>
-            </w:r>
-            <w:r>
-              <w:rPr>
-                <w:noProof/>
-              </w:rPr>
               <w:t>3</w:t>
-            </w:r>
-            <w:r>
-              <w:rPr>
-                <w:noProof/>
-              </w:rPr>
               <w:fldChar w:fldCharType="end"/>
             </w:r>
           </w:hyperlink>
@@ -269,7 +204,7 @@
               <w:noProof/>
             </w:rPr>
           </w:pPr>
-          <w:hyperlink w:anchor="_Toc232196928" w:history="1">
+          <w:hyperlink w:anchor="_Toc232196868" w:history="1">
             <w:r>
               <w:rPr>
                 <w:rStyle w:val="Hyperlink"/>
@@ -282,40 +217,10 @@
                 <w:noProof/>
               </w:rPr>
               <w:tab/>
-            </w:r>
-            <w:r>
-              <w:rPr>
-                <w:noProof/>
-              </w:rPr>
               <w:fldChar w:fldCharType="begin"/>
-            </w:r>
-            <w:r>
-              <w:rPr>
-                <w:noProof/>
-              </w:rPr>
-              <w:instrText xml:space="preserve"> PAGEREF _Toc232196928 \h </w:instrText>
-            </w:r>
-            <w:r>
-              <w:rPr>
-                <w:noProof/>
-              </w:rPr>
-            </w:r>
-            <w:r>
-              <w:rPr>
-                <w:noProof/>
-              </w:rPr>
+              <w:instrText xml:space="preserve"> PAGEREF _Toc232196868 \h </w:instrText>
               <w:fldChar w:fldCharType="separate"/>
-            </w:r>
-            <w:r>
-              <w:rPr>
-                <w:noProof/>
-              </w:rPr>
               <w:t>3</w:t>
-            </w:r>
-            <w:r>
-              <w:rPr>
-                <w:noProof/>
-              </w:rPr>
               <w:fldChar w:fldCharType="end"/>
             </w:r>
           </w:hyperlink>
@@ -330,7 +235,7 @@
               <w:noProof/>
             </w:rPr>
           </w:pPr>
-          <w:hyperlink w:anchor="_Toc232196929" w:history="1">
+          <w:hyperlink w:anchor="_Toc232196869" w:history="1">
             <w:r>
               <w:rPr>
                 <w:rStyle w:val="Hyperlink"/>
@@ -343,40 +248,10 @@
                 <w:noProof/>
               </w:rPr>
               <w:tab/>
-            </w:r>
-            <w:r>
-              <w:rPr>
-                <w:noProof/>
-              </w:rPr>
               <w:fldChar w:fldCharType="begin"/>
-            </w:r>
-            <w:r>
-              <w:rPr>
-                <w:noProof/>
-              </w:rPr>
-              <w:instrText xml:space="preserve"> PAGEREF _Toc232196929 \h </w:instrText>
-            </w:r>
-            <w:r>
-              <w:rPr>
-                <w:noProof/>
-              </w:rPr>
-            </w:r>
-            <w:r>
-              <w:rPr>
-                <w:noProof/>
-              </w:rPr>
+              <w:instrText xml:space="preserve"> PAGEREF _Toc232196869 \h </w:instrText>
               <w:fldChar w:fldCharType="separate"/>
-            </w:r>
-            <w:r>
-              <w:rPr>
-                <w:noProof/>
-              </w:rPr>
               <w:t>3</w:t>
-            </w:r>
-            <w:r>
-              <w:rPr>
-                <w:noProof/>
-              </w:rPr>
               <w:fldChar w:fldCharType="end"/>
             </w:r>
           </w:hyperlink>
@@ -391,13 +266,13 @@
               <w:noProof/>
             </w:rPr>
           </w:pPr>
-          <w:hyperlink w:anchor="_Toc232196930" w:history="1">
+          <w:hyperlink w:anchor="_Toc232196900" w:history="1">
             <w:r>
               <w:rPr>
                 <w:rStyle w:val="Hyperlink"/>
                 <w:noProof/>
               </w:rPr>
-              <w:t>2. Scope</w:t>
+              <w:t>2. Installation</w:t>
             </w:r>
             <w:r>
               <w:rPr>
@@ -415,24 +290,20 @@
               <w:rPr>
                 <w:noProof/>
               </w:rPr>
-              <w:instrText xml:space="preserve"> PAGEREF _Toc232196930 \h </w:instrText>
+              <w:instrText xml:space="preserve"> PAGEREF _Toc232196900 \h </w:instrText>
             </w:r>
             <w:r>
               <w:rPr>
                 <w:noProof/>
               </w:rPr>
-            </w:r>
-            <w:r>
-              <w:rPr>
+              <w:fldChar w:fldCharType="separate"/>
+            </w:r>
+            <w:r>
+              <w:rPr>
+                <w:rStyle w:val="Hyperlink"/>
                 <w:noProof/>
               </w:rPr>
-              <w:fldChar w:fldCharType="separate"/>
-            </w:r>
-            <w:r>
-              <w:rPr>
-                <w:noProof/>
-              </w:rPr>
-              <w:t>4</w:t>
+              <w:t>3</w:t>
             </w:r>
             <w:r>
               <w:rPr>
@@ -452,13 +323,13 @@
               <w:noProof/>
             </w:rPr>
           </w:pPr>
-          <w:hyperlink w:anchor="_Toc232196931" w:history="1">
+          <w:hyperlink w:anchor="_Toc232196901" w:history="1">
             <w:r>
               <w:rPr>
                 <w:rStyle w:val="Hyperlink"/>
                 <w:noProof/>
               </w:rPr>
-              <w:t>2.1 In Scope</w:t>
+              <w:t>2.1 Existing-Installation Detection (FR-36)</w:t>
             </w:r>
             <w:r>
               <w:rPr>
@@ -476,29 +347,56 @@
               <w:rPr>
                 <w:noProof/>
               </w:rPr>
-              <w:instrText xml:space="preserve"> PAGEREF _Toc232196931 \h </w:instrText>
+              <w:instrText xml:space="preserve"> PAGEREF _Toc232196901 \h </w:instrText>
             </w:r>
             <w:r>
               <w:rPr>
                 <w:noProof/>
               </w:rPr>
-            </w:r>
-            <w:r>
-              <w:rPr>
+              <w:fldChar w:fldCharType="separate"/>
+            </w:r>
+            <w:r>
+              <w:rPr>
+                <w:rStyle w:val="Hyperlink"/>
                 <w:noProof/>
               </w:rPr>
+              <w:t>3</w:t>
+            </w:r>
+            <w:r>
+              <w:rPr>
+                <w:noProof/>
+              </w:rPr>
+              <w:fldChar w:fldCharType="end"/>
+            </w:r>
+          </w:hyperlink>
+        </w:p>
+        <w:p>
+          <w:pPr>
+            <w:pStyle w:val="TOC1"/>
+            <w:tabs>
+              <w:tab w:val="right" w:leader="dot" w:pos="9350"/>
+            </w:tabs>
+            <w:rPr>
+              <w:noProof/>
+            </w:rPr>
+          </w:pPr>
+          <w:hyperlink w:anchor="_Toc232196870" w:history="1">
+            <w:r>
+              <w:rPr>
+                <w:rStyle w:val="Hyperlink"/>
+                <w:noProof/>
+              </w:rPr>
+              <w:t>3. Scope</w:t>
+            </w:r>
+            <w:r>
+              <w:rPr>
+                <w:noProof/>
+              </w:rPr>
+              <w:tab/>
+              <w:fldChar w:fldCharType="begin"/>
+              <w:instrText xml:space="preserve"> PAGEREF _Toc232196870 \h </w:instrText>
               <w:fldChar w:fldCharType="separate"/>
-            </w:r>
-            <w:r>
-              <w:rPr>
-                <w:noProof/>
-              </w:rPr>
               <w:t>4</w:t>
-            </w:r>
-            <w:r>
-              <w:rPr>
-                <w:noProof/>
-              </w:rPr>
               <w:fldChar w:fldCharType="end"/>
             </w:r>
           </w:hyperlink>
@@ -513,53 +411,54 @@
               <w:noProof/>
             </w:rPr>
           </w:pPr>
-          <w:hyperlink w:anchor="_Toc232196932" w:history="1">
+          <w:hyperlink w:anchor="_Toc232196871" w:history="1">
             <w:r>
               <w:rPr>
                 <w:rStyle w:val="Hyperlink"/>
                 <w:noProof/>
               </w:rPr>
-              <w:t>2.2 Out of Scope</w:t>
+              <w:t>3.1 In Scope</w:t>
             </w:r>
             <w:r>
               <w:rPr>
                 <w:noProof/>
               </w:rPr>
               <w:tab/>
-            </w:r>
-            <w:r>
-              <w:rPr>
+              <w:fldChar w:fldCharType="begin"/>
+              <w:instrText xml:space="preserve"> PAGEREF _Toc232196871 \h </w:instrText>
+              <w:fldChar w:fldCharType="separate"/>
+              <w:t>4</w:t>
+              <w:fldChar w:fldCharType="end"/>
+            </w:r>
+          </w:hyperlink>
+        </w:p>
+        <w:p>
+          <w:pPr>
+            <w:pStyle w:val="TOC2"/>
+            <w:tabs>
+              <w:tab w:val="right" w:leader="dot" w:pos="9350"/>
+            </w:tabs>
+            <w:rPr>
+              <w:noProof/>
+            </w:rPr>
+          </w:pPr>
+          <w:hyperlink w:anchor="_Toc232196872" w:history="1">
+            <w:r>
+              <w:rPr>
+                <w:rStyle w:val="Hyperlink"/>
                 <w:noProof/>
               </w:rPr>
+              <w:t>3.2 Out of Scope</w:t>
+            </w:r>
+            <w:r>
+              <w:rPr>
+                <w:noProof/>
+              </w:rPr>
+              <w:tab/>
               <w:fldChar w:fldCharType="begin"/>
-            </w:r>
-            <w:r>
-              <w:rPr>
-                <w:noProof/>
-              </w:rPr>
-              <w:instrText xml:space="preserve"> PAGEREF _Toc232196932 \h </w:instrText>
-            </w:r>
-            <w:r>
-              <w:rPr>
-                <w:noProof/>
-              </w:rPr>
-            </w:r>
-            <w:r>
-              <w:rPr>
-                <w:noProof/>
-              </w:rPr>
+              <w:instrText xml:space="preserve"> PAGEREF _Toc232196872 \h </w:instrText>
               <w:fldChar w:fldCharType="separate"/>
-            </w:r>
-            <w:r>
-              <w:rPr>
-                <w:noProof/>
-              </w:rPr>
               <w:t>4</w:t>
-            </w:r>
-            <w:r>
-              <w:rPr>
-                <w:noProof/>
-              </w:rPr>
               <w:fldChar w:fldCharType="end"/>
             </w:r>
           </w:hyperlink>
@@ -574,53 +473,23 @@
               <w:noProof/>
             </w:rPr>
           </w:pPr>
-          <w:hyperlink w:anchor="_Toc232196933" w:history="1">
+          <w:hyperlink w:anchor="_Toc232196873" w:history="1">
             <w:r>
               <w:rPr>
                 <w:rStyle w:val="Hyperlink"/>
                 <w:noProof/>
               </w:rPr>
-              <w:t>3. Stakeholders</w:t>
+              <w:t>4. Stakeholders</w:t>
             </w:r>
             <w:r>
               <w:rPr>
                 <w:noProof/>
               </w:rPr>
               <w:tab/>
-            </w:r>
-            <w:r>
-              <w:rPr>
-                <w:noProof/>
-              </w:rPr>
               <w:fldChar w:fldCharType="begin"/>
-            </w:r>
-            <w:r>
-              <w:rPr>
-                <w:noProof/>
-              </w:rPr>
-              <w:instrText xml:space="preserve"> PAGEREF _Toc232196933 \h </w:instrText>
-            </w:r>
-            <w:r>
-              <w:rPr>
-                <w:noProof/>
-              </w:rPr>
-            </w:r>
-            <w:r>
-              <w:rPr>
-                <w:noProof/>
-              </w:rPr>
+              <w:instrText xml:space="preserve"> PAGEREF _Toc232196873 \h </w:instrText>
               <w:fldChar w:fldCharType="separate"/>
-            </w:r>
-            <w:r>
-              <w:rPr>
-                <w:noProof/>
-              </w:rPr>
               <w:t>5</w:t>
-            </w:r>
-            <w:r>
-              <w:rPr>
-                <w:noProof/>
-              </w:rPr>
               <w:fldChar w:fldCharType="end"/>
             </w:r>
           </w:hyperlink>
@@ -635,53 +504,23 @@
               <w:noProof/>
             </w:rPr>
           </w:pPr>
-          <w:hyperlink w:anchor="_Toc232196934" w:history="1">
+          <w:hyperlink w:anchor="_Toc232196874" w:history="1">
             <w:r>
               <w:rPr>
                 <w:rStyle w:val="Hyperlink"/>
                 <w:noProof/>
               </w:rPr>
-              <w:t>4. Business Objectives</w:t>
+              <w:t>5. Business Objectives</w:t>
             </w:r>
             <w:r>
               <w:rPr>
                 <w:noProof/>
               </w:rPr>
               <w:tab/>
-            </w:r>
-            <w:r>
-              <w:rPr>
-                <w:noProof/>
-              </w:rPr>
               <w:fldChar w:fldCharType="begin"/>
-            </w:r>
-            <w:r>
-              <w:rPr>
-                <w:noProof/>
-              </w:rPr>
-              <w:instrText xml:space="preserve"> PAGEREF _Toc232196934 \h </w:instrText>
-            </w:r>
-            <w:r>
-              <w:rPr>
-                <w:noProof/>
-              </w:rPr>
-            </w:r>
-            <w:r>
-              <w:rPr>
-                <w:noProof/>
-              </w:rPr>
+              <w:instrText xml:space="preserve"> PAGEREF _Toc232196874 \h </w:instrText>
               <w:fldChar w:fldCharType="separate"/>
-            </w:r>
-            <w:r>
-              <w:rPr>
-                <w:noProof/>
-              </w:rPr>
               <w:t>6</w:t>
-            </w:r>
-            <w:r>
-              <w:rPr>
-                <w:noProof/>
-              </w:rPr>
               <w:fldChar w:fldCharType="end"/>
             </w:r>
           </w:hyperlink>
@@ -696,53 +535,23 @@
               <w:noProof/>
             </w:rPr>
           </w:pPr>
-          <w:hyperlink w:anchor="_Toc232196935" w:history="1">
+          <w:hyperlink w:anchor="_Toc232196875" w:history="1">
             <w:r>
               <w:rPr>
                 <w:rStyle w:val="Hyperlink"/>
                 <w:noProof/>
               </w:rPr>
-              <w:t>5. Functional Requirements</w:t>
+              <w:t>6. Functional Requirements</w:t>
             </w:r>
             <w:r>
               <w:rPr>
                 <w:noProof/>
               </w:rPr>
               <w:tab/>
-            </w:r>
-            <w:r>
-              <w:rPr>
-                <w:noProof/>
-              </w:rPr>
               <w:fldChar w:fldCharType="begin"/>
-            </w:r>
-            <w:r>
-              <w:rPr>
-                <w:noProof/>
-              </w:rPr>
-              <w:instrText xml:space="preserve"> PAGEREF _Toc232196935 \h </w:instrText>
-            </w:r>
-            <w:r>
-              <w:rPr>
-                <w:noProof/>
-              </w:rPr>
-            </w:r>
-            <w:r>
-              <w:rPr>
-                <w:noProof/>
-              </w:rPr>
+              <w:instrText xml:space="preserve"> PAGEREF _Toc232196875 \h </w:instrText>
               <w:fldChar w:fldCharType="separate"/>
-            </w:r>
-            <w:r>
-              <w:rPr>
-                <w:noProof/>
-              </w:rPr>
               <w:t>7</w:t>
-            </w:r>
-            <w:r>
-              <w:rPr>
-                <w:noProof/>
-              </w:rPr>
               <w:fldChar w:fldCharType="end"/>
             </w:r>
           </w:hyperlink>
@@ -757,53 +566,23 @@
               <w:noProof/>
             </w:rPr>
           </w:pPr>
-          <w:hyperlink w:anchor="_Toc232196936" w:history="1">
+          <w:hyperlink w:anchor="_Toc232196876" w:history="1">
             <w:r>
               <w:rPr>
                 <w:rStyle w:val="Hyperlink"/>
                 <w:noProof/>
               </w:rPr>
-              <w:t>5.1 Drive and Folder Tree</w:t>
+              <w:t>6.1 Drive and Folder Tree</w:t>
             </w:r>
             <w:r>
               <w:rPr>
                 <w:noProof/>
               </w:rPr>
               <w:tab/>
-            </w:r>
-            <w:r>
-              <w:rPr>
-                <w:noProof/>
-              </w:rPr>
               <w:fldChar w:fldCharType="begin"/>
-            </w:r>
-            <w:r>
-              <w:rPr>
-                <w:noProof/>
-              </w:rPr>
-              <w:instrText xml:space="preserve"> PAGEREF _Toc232196936 \h </w:instrText>
-            </w:r>
-            <w:r>
-              <w:rPr>
-                <w:noProof/>
-              </w:rPr>
-            </w:r>
-            <w:r>
-              <w:rPr>
-                <w:noProof/>
-              </w:rPr>
+              <w:instrText xml:space="preserve"> PAGEREF _Toc232196876 \h </w:instrText>
               <w:fldChar w:fldCharType="separate"/>
-            </w:r>
-            <w:r>
-              <w:rPr>
-                <w:noProof/>
-              </w:rPr>
               <w:t>7</w:t>
-            </w:r>
-            <w:r>
-              <w:rPr>
-                <w:noProof/>
-              </w:rPr>
               <w:fldChar w:fldCharType="end"/>
             </w:r>
           </w:hyperlink>
@@ -818,53 +597,23 @@
               <w:noProof/>
             </w:rPr>
           </w:pPr>
-          <w:hyperlink w:anchor="_Toc232196937" w:history="1">
+          <w:hyperlink w:anchor="_Toc232196877" w:history="1">
             <w:r>
               <w:rPr>
                 <w:rStyle w:val="Hyperlink"/>
                 <w:noProof/>
               </w:rPr>
-              <w:t>5.2 File List</w:t>
+              <w:t>6.2 File List</w:t>
             </w:r>
             <w:r>
               <w:rPr>
                 <w:noProof/>
               </w:rPr>
               <w:tab/>
-            </w:r>
-            <w:r>
-              <w:rPr>
-                <w:noProof/>
-              </w:rPr>
               <w:fldChar w:fldCharType="begin"/>
-            </w:r>
-            <w:r>
-              <w:rPr>
-                <w:noProof/>
-              </w:rPr>
-              <w:instrText xml:space="preserve"> PAGEREF _Toc232196937 \h </w:instrText>
-            </w:r>
-            <w:r>
-              <w:rPr>
-                <w:noProof/>
-              </w:rPr>
-            </w:r>
-            <w:r>
-              <w:rPr>
-                <w:noProof/>
-              </w:rPr>
+              <w:instrText xml:space="preserve"> PAGEREF _Toc232196877 \h </w:instrText>
               <w:fldChar w:fldCharType="separate"/>
-            </w:r>
-            <w:r>
-              <w:rPr>
-                <w:noProof/>
-              </w:rPr>
               <w:t>7</w:t>
-            </w:r>
-            <w:r>
-              <w:rPr>
-                <w:noProof/>
-              </w:rPr>
               <w:fldChar w:fldCharType="end"/>
             </w:r>
           </w:hyperlink>
@@ -879,53 +628,23 @@
               <w:noProof/>
             </w:rPr>
           </w:pPr>
-          <w:hyperlink w:anchor="_Toc232196938" w:history="1">
+          <w:hyperlink w:anchor="_Toc232196878" w:history="1">
             <w:r>
               <w:rPr>
                 <w:rStyle w:val="Hyperlink"/>
                 <w:noProof/>
               </w:rPr>
-              <w:t>5.3 Navigation</w:t>
+              <w:t>6.3 Navigation</w:t>
             </w:r>
             <w:r>
               <w:rPr>
                 <w:noProof/>
               </w:rPr>
               <w:tab/>
-            </w:r>
-            <w:r>
-              <w:rPr>
-                <w:noProof/>
-              </w:rPr>
               <w:fldChar w:fldCharType="begin"/>
-            </w:r>
-            <w:r>
-              <w:rPr>
-                <w:noProof/>
-              </w:rPr>
-              <w:instrText xml:space="preserve"> PAGEREF _Toc232196938 \h </w:instrText>
-            </w:r>
-            <w:r>
-              <w:rPr>
-                <w:noProof/>
-              </w:rPr>
-            </w:r>
-            <w:r>
-              <w:rPr>
-                <w:noProof/>
-              </w:rPr>
+              <w:instrText xml:space="preserve"> PAGEREF _Toc232196878 \h </w:instrText>
               <w:fldChar w:fldCharType="separate"/>
-            </w:r>
-            <w:r>
-              <w:rPr>
-                <w:noProof/>
-              </w:rPr>
               <w:t>8</w:t>
-            </w:r>
-            <w:r>
-              <w:rPr>
-                <w:noProof/>
-              </w:rPr>
               <w:fldChar w:fldCharType="end"/>
             </w:r>
           </w:hyperlink>
@@ -940,53 +659,23 @@
               <w:noProof/>
             </w:rPr>
           </w:pPr>
-          <w:hyperlink w:anchor="_Toc232196939" w:history="1">
+          <w:hyperlink w:anchor="_Toc232196879" w:history="1">
             <w:r>
               <w:rPr>
                 <w:rStyle w:val="Hyperlink"/>
                 <w:noProof/>
               </w:rPr>
-              <w:t>5.4 Background Size Scanning</w:t>
+              <w:t>6.4 Background Size Scanning</w:t>
             </w:r>
             <w:r>
               <w:rPr>
                 <w:noProof/>
               </w:rPr>
               <w:tab/>
-            </w:r>
-            <w:r>
-              <w:rPr>
-                <w:noProof/>
-              </w:rPr>
               <w:fldChar w:fldCharType="begin"/>
-            </w:r>
-            <w:r>
-              <w:rPr>
-                <w:noProof/>
-              </w:rPr>
-              <w:instrText xml:space="preserve"> PAGEREF _Toc232196939 \h </w:instrText>
-            </w:r>
-            <w:r>
-              <w:rPr>
-                <w:noProof/>
-              </w:rPr>
-            </w:r>
-            <w:r>
-              <w:rPr>
-                <w:noProof/>
-              </w:rPr>
+              <w:instrText xml:space="preserve"> PAGEREF _Toc232196879 \h </w:instrText>
               <w:fldChar w:fldCharType="separate"/>
-            </w:r>
-            <w:r>
-              <w:rPr>
-                <w:noProof/>
-              </w:rPr>
               <w:t>8</w:t>
-            </w:r>
-            <w:r>
-              <w:rPr>
-                <w:noProof/>
-              </w:rPr>
               <w:fldChar w:fldCharType="end"/>
             </w:r>
           </w:hyperlink>
@@ -1001,53 +690,23 @@
               <w:noProof/>
             </w:rPr>
           </w:pPr>
-          <w:hyperlink w:anchor="_Toc232196940" w:history="1">
+          <w:hyperlink w:anchor="_Toc232196880" w:history="1">
             <w:r>
               <w:rPr>
                 <w:rStyle w:val="Hyperlink"/>
                 <w:noProof/>
               </w:rPr>
-              <w:t>5.5 Filtering</w:t>
+              <w:t>6.5 Filtering</w:t>
             </w:r>
             <w:r>
               <w:rPr>
                 <w:noProof/>
               </w:rPr>
               <w:tab/>
-            </w:r>
-            <w:r>
-              <w:rPr>
-                <w:noProof/>
-              </w:rPr>
               <w:fldChar w:fldCharType="begin"/>
-            </w:r>
-            <w:r>
-              <w:rPr>
-                <w:noProof/>
-              </w:rPr>
-              <w:instrText xml:space="preserve"> PAGEREF _Toc232196940 \h </w:instrText>
-            </w:r>
-            <w:r>
-              <w:rPr>
-                <w:noProof/>
-              </w:rPr>
-            </w:r>
-            <w:r>
-              <w:rPr>
-                <w:noProof/>
-              </w:rPr>
+              <w:instrText xml:space="preserve"> PAGEREF _Toc232196880 \h </w:instrText>
               <w:fldChar w:fldCharType="separate"/>
-            </w:r>
-            <w:r>
-              <w:rPr>
-                <w:noProof/>
-              </w:rPr>
               <w:t>8</w:t>
-            </w:r>
-            <w:r>
-              <w:rPr>
-                <w:noProof/>
-              </w:rPr>
               <w:fldChar w:fldCharType="end"/>
             </w:r>
           </w:hyperlink>
@@ -1062,53 +721,23 @@
               <w:noProof/>
             </w:rPr>
           </w:pPr>
-          <w:hyperlink w:anchor="_Toc232196941" w:history="1">
+          <w:hyperlink w:anchor="_Toc232196881" w:history="1">
             <w:r>
               <w:rPr>
                 <w:rStyle w:val="Hyperlink"/>
                 <w:noProof/>
               </w:rPr>
-              <w:t>5.6 Sorting</w:t>
+              <w:t>6.6 Sorting</w:t>
             </w:r>
             <w:r>
               <w:rPr>
                 <w:noProof/>
               </w:rPr>
               <w:tab/>
-            </w:r>
-            <w:r>
-              <w:rPr>
-                <w:noProof/>
-              </w:rPr>
               <w:fldChar w:fldCharType="begin"/>
-            </w:r>
-            <w:r>
-              <w:rPr>
-                <w:noProof/>
-              </w:rPr>
-              <w:instrText xml:space="preserve"> PAGEREF _Toc232196941 \h </w:instrText>
-            </w:r>
-            <w:r>
-              <w:rPr>
-                <w:noProof/>
-              </w:rPr>
-            </w:r>
-            <w:r>
-              <w:rPr>
-                <w:noProof/>
-              </w:rPr>
+              <w:instrText xml:space="preserve"> PAGEREF _Toc232196881 \h </w:instrText>
               <w:fldChar w:fldCharType="separate"/>
-            </w:r>
-            <w:r>
-              <w:rPr>
-                <w:noProof/>
-              </w:rPr>
               <w:t>9</w:t>
-            </w:r>
-            <w:r>
-              <w:rPr>
-                <w:noProof/>
-              </w:rPr>
               <w:fldChar w:fldCharType="end"/>
             </w:r>
           </w:hyperlink>
@@ -1123,53 +752,23 @@
               <w:noProof/>
             </w:rPr>
           </w:pPr>
-          <w:hyperlink w:anchor="_Toc232196942" w:history="1">
+          <w:hyperlink w:anchor="_Toc232196882" w:history="1">
             <w:r>
               <w:rPr>
                 <w:rStyle w:val="Hyperlink"/>
                 <w:noProof/>
               </w:rPr>
-              <w:t>5.7 File Operations</w:t>
+              <w:t>6.7 File Operations</w:t>
             </w:r>
             <w:r>
               <w:rPr>
                 <w:noProof/>
               </w:rPr>
               <w:tab/>
-            </w:r>
-            <w:r>
-              <w:rPr>
-                <w:noProof/>
-              </w:rPr>
               <w:fldChar w:fldCharType="begin"/>
-            </w:r>
-            <w:r>
-              <w:rPr>
-                <w:noProof/>
-              </w:rPr>
-              <w:instrText xml:space="preserve"> PAGEREF _Toc232196942 \h </w:instrText>
-            </w:r>
-            <w:r>
-              <w:rPr>
-                <w:noProof/>
-              </w:rPr>
-            </w:r>
-            <w:r>
-              <w:rPr>
-                <w:noProof/>
-              </w:rPr>
+              <w:instrText xml:space="preserve"> PAGEREF _Toc232196882 \h </w:instrText>
               <w:fldChar w:fldCharType="separate"/>
-            </w:r>
-            <w:r>
-              <w:rPr>
-                <w:noProof/>
-              </w:rPr>
               <w:t>10</w:t>
-            </w:r>
-            <w:r>
-              <w:rPr>
-                <w:noProof/>
-              </w:rPr>
               <w:fldChar w:fldCharType="end"/>
             </w:r>
           </w:hyperlink>
@@ -1184,53 +783,23 @@
               <w:noProof/>
             </w:rPr>
           </w:pPr>
-          <w:hyperlink w:anchor="_Toc232196943" w:history="1">
+          <w:hyperlink w:anchor="_Toc232196883" w:history="1">
             <w:r>
               <w:rPr>
                 <w:rStyle w:val="Hyperlink"/>
                 <w:noProof/>
               </w:rPr>
-              <w:t>5.8 Live File System Monitoring</w:t>
+              <w:t>6.8 Live File System Monitoring</w:t>
             </w:r>
             <w:r>
               <w:rPr>
                 <w:noProof/>
               </w:rPr>
               <w:tab/>
-            </w:r>
-            <w:r>
-              <w:rPr>
-                <w:noProof/>
-              </w:rPr>
               <w:fldChar w:fldCharType="begin"/>
-            </w:r>
-            <w:r>
-              <w:rPr>
-                <w:noProof/>
-              </w:rPr>
-              <w:instrText xml:space="preserve"> PAGEREF _Toc232196943 \h </w:instrText>
-            </w:r>
-            <w:r>
-              <w:rPr>
-                <w:noProof/>
-              </w:rPr>
-            </w:r>
-            <w:r>
-              <w:rPr>
-                <w:noProof/>
-              </w:rPr>
+              <w:instrText xml:space="preserve"> PAGEREF _Toc232196883 \h </w:instrText>
               <w:fldChar w:fldCharType="separate"/>
-            </w:r>
-            <w:r>
-              <w:rPr>
-                <w:noProof/>
-              </w:rPr>
               <w:t>10</w:t>
-            </w:r>
-            <w:r>
-              <w:rPr>
-                <w:noProof/>
-              </w:rPr>
               <w:fldChar w:fldCharType="end"/>
             </w:r>
           </w:hyperlink>
@@ -1245,48 +814,75 @@
               <w:noProof/>
             </w:rPr>
           </w:pPr>
-          <w:hyperlink w:anchor="_Toc232196944" w:history="1">
+          <w:hyperlink w:anchor="_Toc232196884" w:history="1">
             <w:r>
               <w:rPr>
                 <w:rStyle w:val="Hyperlink"/>
                 <w:noProof/>
               </w:rPr>
-              <w:t>5.9 Settings and Persistence</w:t>
+              <w:t>6.9 Settings and Persistence</w:t>
             </w:r>
             <w:r>
               <w:rPr>
                 <w:noProof/>
               </w:rPr>
               <w:tab/>
-            </w:r>
-            <w:r>
-              <w:rPr>
+              <w:fldChar w:fldCharType="begin"/>
+              <w:instrText xml:space="preserve"> PAGEREF _Toc232196884 \h </w:instrText>
+              <w:fldChar w:fldCharType="separate"/>
+              <w:t>10</w:t>
+              <w:fldChar w:fldCharType="end"/>
+            </w:r>
+          </w:hyperlink>
+        </w:p>
+        <w:p>
+          <w:pPr>
+            <w:pStyle w:val="TOC2"/>
+            <w:tabs>
+              <w:tab w:val="right" w:leader="dot" w:pos="9350"/>
+            </w:tabs>
+            <w:rPr>
+              <w:noProof/>
+            </w:rPr>
+          </w:pPr>
+          <w:hyperlink w:anchor="_Toc232196902" w:history="1">
+            <w:r>
+              <w:rPr>
+                <w:rStyle w:val="Hyperlink"/>
                 <w:noProof/>
               </w:rPr>
+              <w:t>6.10 Installer</w:t>
+            </w:r>
+            <w:r>
+              <w:rPr>
+                <w:noProof/>
+              </w:rPr>
+              <w:tab/>
+            </w:r>
+            <w:r>
+              <w:rPr>
+                <w:noProof/>
+              </w:rPr>
               <w:fldChar w:fldCharType="begin"/>
             </w:r>
             <w:r>
               <w:rPr>
                 <w:noProof/>
               </w:rPr>
-              <w:instrText xml:space="preserve"> PAGEREF _Toc232196944 \h </w:instrText>
+              <w:instrText xml:space="preserve"> PAGEREF _Toc232196902 \h </w:instrText>
             </w:r>
             <w:r>
               <w:rPr>
                 <w:noProof/>
               </w:rPr>
-            </w:r>
-            <w:r>
-              <w:rPr>
+              <w:fldChar w:fldCharType="separate"/>
+            </w:r>
+            <w:r>
+              <w:rPr>
+                <w:rStyle w:val="Hyperlink"/>
                 <w:noProof/>
               </w:rPr>
-              <w:fldChar w:fldCharType="separate"/>
-            </w:r>
-            <w:r>
-              <w:rPr>
-                <w:noProof/>
-              </w:rPr>
-              <w:t>10</w:t>
+              <w:t>12</w:t>
             </w:r>
             <w:r>
               <w:rPr>
@@ -1310,46 +906,22 @@
               <w:noProof/>
             </w:rPr>
             <w:fldChar w:fldCharType="begin"/>
+            <w:instrText xml:space="preserve"/>
+          </w:r>
+          <w:r>
+            <w:rPr>
+              <w:noProof/>
+            </w:rPr>
+            <w:instrText>HYPERLINK \l "_Toc232196885"</w:instrText>
           </w:r>
           <w:r>
             <w:rPr>
               <w:rStyle w:val="Hyperlink"/>
               <w:noProof/>
             </w:rPr>
-            <w:instrText xml:space="preserve"> </w:instrText>
-          </w:r>
-          <w:r>
-            <w:rPr>
-              <w:noProof/>
-            </w:rPr>
-            <w:instrText>HYPERLINK \l "_Toc232196945"</w:instrText>
-          </w:r>
-          <w:r>
-            <w:rPr>
-              <w:rStyle w:val="Hyperlink"/>
-              <w:noProof/>
-            </w:rPr>
-            <w:instrText xml:space="preserve"> </w:instrText>
-          </w:r>
-          <w:r>
-            <w:rPr>
-              <w:rStyle w:val="Hyperlink"/>
-              <w:noProof/>
-            </w:rPr>
-          </w:r>
-          <w:r>
-            <w:rPr>
-              <w:rStyle w:val="Hyperlink"/>
-              <w:noProof/>
-            </w:rPr>
+            <w:instrText xml:space="preserve"/>
             <w:fldChar w:fldCharType="separate"/>
-          </w:r>
-          <w:r>
-            <w:rPr>
-              <w:rStyle w:val="Hyperlink"/>
-              <w:noProof/>
-            </w:rPr>
-            <w:t>5.10 Installer</w:t>
+            <w:t>6.10 Installer</w:t>
           </w:r>
         </w:p>
         <w:p>
@@ -1382,47 +954,17 @@
               <w:rStyle w:val="Hyperlink"/>
               <w:noProof/>
             </w:rPr>
-            <w:t>6. Non-Functional Requirements</w:t>
+            <w:t>7. Non-Functional Requirements</w:t>
           </w:r>
           <w:r>
             <w:rPr>
               <w:noProof/>
             </w:rPr>
             <w:tab/>
-          </w:r>
-          <w:r>
-            <w:rPr>
-              <w:noProof/>
-            </w:rPr>
             <w:fldChar w:fldCharType="begin"/>
-          </w:r>
-          <w:r>
-            <w:rPr>
-              <w:noProof/>
-            </w:rPr>
-            <w:instrText xml:space="preserve"> PAGEREF _Toc232196945 \h </w:instrText>
-          </w:r>
-          <w:r>
-            <w:rPr>
-              <w:noProof/>
-            </w:rPr>
-          </w:r>
-          <w:r>
-            <w:rPr>
-              <w:noProof/>
-            </w:rPr>
+            <w:instrText xml:space="preserve"> PAGEREF _Toc232196885 \h </w:instrText>
             <w:fldChar w:fldCharType="separate"/>
-          </w:r>
-          <w:r>
-            <w:rPr>
-              <w:noProof/>
-            </w:rPr>
             <w:t>12</w:t>
-          </w:r>
-          <w:r>
-            <w:rPr>
-              <w:noProof/>
-            </w:rPr>
             <w:fldChar w:fldCharType="end"/>
           </w:r>
           <w:r>
@@ -1443,53 +985,23 @@
               <w:noProof/>
             </w:rPr>
           </w:pPr>
-          <w:hyperlink w:anchor="_Toc232196946" w:history="1">
+          <w:hyperlink w:anchor="_Toc232196886" w:history="1">
             <w:r>
               <w:rPr>
                 <w:rStyle w:val="Hyperlink"/>
                 <w:noProof/>
               </w:rPr>
-              <w:t>7. Constraints and Assumptions</w:t>
+              <w:t>8. Constraints and Assumptions</w:t>
             </w:r>
             <w:r>
               <w:rPr>
                 <w:noProof/>
               </w:rPr>
               <w:tab/>
-            </w:r>
-            <w:r>
-              <w:rPr>
-                <w:noProof/>
-              </w:rPr>
               <w:fldChar w:fldCharType="begin"/>
-            </w:r>
-            <w:r>
-              <w:rPr>
-                <w:noProof/>
-              </w:rPr>
-              <w:instrText xml:space="preserve"> PAGEREF _Toc232196946 \h </w:instrText>
-            </w:r>
-            <w:r>
-              <w:rPr>
-                <w:noProof/>
-              </w:rPr>
-            </w:r>
-            <w:r>
-              <w:rPr>
-                <w:noProof/>
-              </w:rPr>
+              <w:instrText xml:space="preserve"> PAGEREF _Toc232196886 \h </w:instrText>
               <w:fldChar w:fldCharType="separate"/>
-            </w:r>
-            <w:r>
-              <w:rPr>
-                <w:noProof/>
-              </w:rPr>
               <w:t>13</w:t>
-            </w:r>
-            <w:r>
-              <w:rPr>
-                <w:noProof/>
-              </w:rPr>
               <w:fldChar w:fldCharType="end"/>
             </w:r>
           </w:hyperlink>
@@ -1504,53 +1016,23 @@
               <w:noProof/>
             </w:rPr>
           </w:pPr>
-          <w:hyperlink w:anchor="_Toc232196947" w:history="1">
+          <w:hyperlink w:anchor="_Toc232196887" w:history="1">
             <w:r>
               <w:rPr>
                 <w:rStyle w:val="Hyperlink"/>
                 <w:noProof/>
               </w:rPr>
-              <w:t>7.1 Constraints</w:t>
+              <w:t>8.1 Constraints</w:t>
             </w:r>
             <w:r>
               <w:rPr>
                 <w:noProof/>
               </w:rPr>
               <w:tab/>
-            </w:r>
-            <w:r>
-              <w:rPr>
-                <w:noProof/>
-              </w:rPr>
               <w:fldChar w:fldCharType="begin"/>
-            </w:r>
-            <w:r>
-              <w:rPr>
-                <w:noProof/>
-              </w:rPr>
-              <w:instrText xml:space="preserve"> PAGEREF _Toc232196947 \h </w:instrText>
-            </w:r>
-            <w:r>
-              <w:rPr>
-                <w:noProof/>
-              </w:rPr>
-            </w:r>
-            <w:r>
-              <w:rPr>
-                <w:noProof/>
-              </w:rPr>
+              <w:instrText xml:space="preserve"> PAGEREF _Toc232196887 \h </w:instrText>
               <w:fldChar w:fldCharType="separate"/>
-            </w:r>
-            <w:r>
-              <w:rPr>
-                <w:noProof/>
-              </w:rPr>
               <w:t>13</w:t>
-            </w:r>
-            <w:r>
-              <w:rPr>
-                <w:noProof/>
-              </w:rPr>
               <w:fldChar w:fldCharType="end"/>
             </w:r>
           </w:hyperlink>
@@ -1565,53 +1047,23 @@
               <w:noProof/>
             </w:rPr>
           </w:pPr>
-          <w:hyperlink w:anchor="_Toc232196948" w:history="1">
+          <w:hyperlink w:anchor="_Toc232196888" w:history="1">
             <w:r>
               <w:rPr>
                 <w:rStyle w:val="Hyperlink"/>
                 <w:noProof/>
               </w:rPr>
-              <w:t>7.2 Assumptions</w:t>
+              <w:t>8.2 Assumptions</w:t>
             </w:r>
             <w:r>
               <w:rPr>
                 <w:noProof/>
               </w:rPr>
               <w:tab/>
-            </w:r>
-            <w:r>
-              <w:rPr>
-                <w:noProof/>
-              </w:rPr>
               <w:fldChar w:fldCharType="begin"/>
-            </w:r>
-            <w:r>
-              <w:rPr>
-                <w:noProof/>
-              </w:rPr>
-              <w:instrText xml:space="preserve"> PAGEREF _Toc232196948 \h </w:instrText>
-            </w:r>
-            <w:r>
-              <w:rPr>
-                <w:noProof/>
-              </w:rPr>
-            </w:r>
-            <w:r>
-              <w:rPr>
-                <w:noProof/>
-              </w:rPr>
+              <w:instrText xml:space="preserve"> PAGEREF _Toc232196888 \h </w:instrText>
               <w:fldChar w:fldCharType="separate"/>
-            </w:r>
-            <w:r>
-              <w:rPr>
-                <w:noProof/>
-              </w:rPr>
               <w:t>13</w:t>
-            </w:r>
-            <w:r>
-              <w:rPr>
-                <w:noProof/>
-              </w:rPr>
               <w:fldChar w:fldCharType="end"/>
             </w:r>
           </w:hyperlink>
@@ -1626,53 +1078,23 @@
               <w:noProof/>
             </w:rPr>
           </w:pPr>
-          <w:hyperlink w:anchor="_Toc232196949" w:history="1">
+          <w:hyperlink w:anchor="_Toc232196889" w:history="1">
             <w:r>
               <w:rPr>
                 <w:rStyle w:val="Hyperlink"/>
                 <w:noProof/>
               </w:rPr>
-              <w:t>9. Requirements Amendments — Session 4 (2026-06-12)</w:t>
+              <w:t>10. Requirements Amendments — Session 4 (2026-06-12)</w:t>
             </w:r>
             <w:r>
               <w:rPr>
                 <w:noProof/>
               </w:rPr>
               <w:tab/>
-            </w:r>
-            <w:r>
-              <w:rPr>
-                <w:noProof/>
-              </w:rPr>
               <w:fldChar w:fldCharType="begin"/>
-            </w:r>
-            <w:r>
-              <w:rPr>
-                <w:noProof/>
-              </w:rPr>
-              <w:instrText xml:space="preserve"> PAGEREF _Toc232196949 \h </w:instrText>
-            </w:r>
-            <w:r>
-              <w:rPr>
-                <w:noProof/>
-              </w:rPr>
-            </w:r>
-            <w:r>
-              <w:rPr>
-                <w:noProof/>
-              </w:rPr>
+              <w:instrText xml:space="preserve"> PAGEREF _Toc232196889 \h </w:instrText>
               <w:fldChar w:fldCharType="separate"/>
-            </w:r>
-            <w:r>
-              <w:rPr>
-                <w:noProof/>
-              </w:rPr>
               <w:t>14</w:t>
-            </w:r>
-            <w:r>
-              <w:rPr>
-                <w:noProof/>
-              </w:rPr>
               <w:fldChar w:fldCharType="end"/>
             </w:r>
           </w:hyperlink>
@@ -1687,53 +1109,23 @@
               <w:noProof/>
             </w:rPr>
           </w:pPr>
-          <w:hyperlink w:anchor="_Toc232196950" w:history="1">
+          <w:hyperlink w:anchor="_Toc232196890" w:history="1">
             <w:r>
               <w:rPr>
                 <w:rStyle w:val="Hyperlink"/>
                 <w:noProof/>
               </w:rPr>
-              <w:t>9.1  FR-23 Amendment: Parent Node Filter Bar on Expand</w:t>
+              <w:t>10.1  FR-23 Amendment: Parent Node Filter Bar on Expand</w:t>
             </w:r>
             <w:r>
               <w:rPr>
                 <w:noProof/>
               </w:rPr>
               <w:tab/>
-            </w:r>
-            <w:r>
-              <w:rPr>
-                <w:noProof/>
-              </w:rPr>
               <w:fldChar w:fldCharType="begin"/>
-            </w:r>
-            <w:r>
-              <w:rPr>
-                <w:noProof/>
-              </w:rPr>
-              <w:instrText xml:space="preserve"> PAGEREF _Toc232196950 \h </w:instrText>
-            </w:r>
-            <w:r>
-              <w:rPr>
-                <w:noProof/>
-              </w:rPr>
-            </w:r>
-            <w:r>
-              <w:rPr>
-                <w:noProof/>
-              </w:rPr>
+              <w:instrText xml:space="preserve"> PAGEREF _Toc232196890 \h </w:instrText>
               <w:fldChar w:fldCharType="separate"/>
-            </w:r>
-            <w:r>
-              <w:rPr>
-                <w:noProof/>
-              </w:rPr>
               <w:t>14</w:t>
-            </w:r>
-            <w:r>
-              <w:rPr>
-                <w:noProof/>
-              </w:rPr>
               <w:fldChar w:fldCharType="end"/>
             </w:r>
           </w:hyperlink>
@@ -1748,53 +1140,23 @@
               <w:noProof/>
             </w:rPr>
           </w:pPr>
-          <w:hyperlink w:anchor="_Toc232196951" w:history="1">
+          <w:hyperlink w:anchor="_Toc232196891" w:history="1">
             <w:r>
               <w:rPr>
                 <w:rStyle w:val="Hyperlink"/>
                 <w:noProof/>
               </w:rPr>
-              <w:t>9.2  NFR-02 Clarification: Targeted Repaint on Filter Completion</w:t>
+              <w:t>10.2  NFR-02 Clarification: Targeted Repaint on Filter Completion</w:t>
             </w:r>
             <w:r>
               <w:rPr>
                 <w:noProof/>
               </w:rPr>
               <w:tab/>
-            </w:r>
-            <w:r>
-              <w:rPr>
-                <w:noProof/>
-              </w:rPr>
               <w:fldChar w:fldCharType="begin"/>
-            </w:r>
-            <w:r>
-              <w:rPr>
-                <w:noProof/>
-              </w:rPr>
-              <w:instrText xml:space="preserve"> PAGEREF _Toc232196951 \h </w:instrText>
-            </w:r>
-            <w:r>
-              <w:rPr>
-                <w:noProof/>
-              </w:rPr>
-            </w:r>
-            <w:r>
-              <w:rPr>
-                <w:noProof/>
-              </w:rPr>
+              <w:instrText xml:space="preserve"> PAGEREF _Toc232196891 \h </w:instrText>
               <w:fldChar w:fldCharType="separate"/>
-            </w:r>
-            <w:r>
-              <w:rPr>
-                <w:noProof/>
-              </w:rPr>
               <w:t>14</w:t>
-            </w:r>
-            <w:r>
-              <w:rPr>
-                <w:noProof/>
-              </w:rPr>
               <w:fldChar w:fldCharType="end"/>
             </w:r>
           </w:hyperlink>
@@ -1809,53 +1171,23 @@
               <w:noProof/>
             </w:rPr>
           </w:pPr>
-          <w:hyperlink w:anchor="_Toc232196952" w:history="1">
+          <w:hyperlink w:anchor="_Toc232196892" w:history="1">
             <w:r>
               <w:rPr>
                 <w:rStyle w:val="Hyperlink"/>
                 <w:noProof/>
               </w:rPr>
-              <w:t>8. Glossary</w:t>
+              <w:t>9. Glossary</w:t>
             </w:r>
             <w:r>
               <w:rPr>
                 <w:noProof/>
               </w:rPr>
               <w:tab/>
-            </w:r>
-            <w:r>
-              <w:rPr>
-                <w:noProof/>
-              </w:rPr>
               <w:fldChar w:fldCharType="begin"/>
-            </w:r>
-            <w:r>
-              <w:rPr>
-                <w:noProof/>
-              </w:rPr>
-              <w:instrText xml:space="preserve"> PAGEREF _Toc232196952 \h </w:instrText>
-            </w:r>
-            <w:r>
-              <w:rPr>
-                <w:noProof/>
-              </w:rPr>
-            </w:r>
-            <w:r>
-              <w:rPr>
-                <w:noProof/>
-              </w:rPr>
+              <w:instrText xml:space="preserve"> PAGEREF _Toc232196892 \h </w:instrText>
               <w:fldChar w:fldCharType="separate"/>
-            </w:r>
-            <w:r>
-              <w:rPr>
-                <w:noProof/>
-              </w:rPr>
               <w:t>14</w:t>
-            </w:r>
-            <w:r>
-              <w:rPr>
-                <w:noProof/>
-              </w:rPr>
               <w:fldChar w:fldCharType="end"/>
             </w:r>
           </w:hyperlink>
@@ -1876,9 +1208,8 @@
       <w:pPr>
         <w:pStyle w:val="Heading1"/>
       </w:pPr>
-      <w:bookmarkStart w:id="1" w:name="_Toc232196927"/>
+      <w:bookmarkStart w:id="1" w:name="_Toc232196867"/>
       <w:r>
-        <w:lastRenderedPageBreak/>
         <w:t>1. Introduction</w:t>
       </w:r>
       <w:bookmarkEnd w:id="1"/>
@@ -1887,7 +1218,7 @@
       <w:pPr>
         <w:pStyle w:val="Heading2"/>
       </w:pPr>
-      <w:bookmarkStart w:id="2" w:name="_Toc232196928"/>
+      <w:bookmarkStart w:id="2" w:name="_Toc232196868"/>
       <w:r>
         <w:t>1.1 Purpose</w:t>
       </w:r>
@@ -1905,7 +1236,7 @@
       <w:pPr>
         <w:pStyle w:val="Heading2"/>
       </w:pPr>
-      <w:bookmarkStart w:id="3" w:name="_Toc232196929"/>
+      <w:bookmarkStart w:id="3" w:name="_Toc232196869"/>
       <w:r>
         <w:t>1.2 Background</w:t>
       </w:r>
@@ -1932,11 +1263,101 @@
     <w:p>
       <w:pPr>
         <w:pStyle w:val="Heading1"/>
+        <w:spacing w:before="320" w:after="160"/>
       </w:pPr>
-      <w:bookmarkStart w:id="4" w:name="_Toc232196930"/>
+      <w:bookmarkStart w:id="30" w:name="_Toc232196900"/>
       <w:r>
-        <w:lastRenderedPageBreak/>
-        <w:t>2. Scope</w:t>
+        <w:t>2. Installation</w:t>
+      </w:r>
+      <w:bookmarkEnd w:id="30"/>
+    </w:p>
+    <w:p>
+      <w:r>
+        <w:rPr>
+          <w:color w:val="000000"/>
+          <w:sz w:val="20"/>
+          <w:szCs w:val="20"/>
+        </w:rPr>
+        <w:t>The File Explorer application ships with an Inno Setup installer (FileExplorerSetup.exe) that supports both first-time installation and upgrade of an existing installation.</w:t>
+      </w:r>
+    </w:p>
+    <w:p>
+      <w:pPr>
+        <w:pStyle w:val="Heading2"/>
+        <w:spacing w:after="100"/>
+      </w:pPr>
+      <w:bookmarkStart w:id="31" w:name="_Toc232196901"/>
+      <w:r>
+        <w:rPr>
+          <w:sz w:val="24"/>
+          <w:szCs w:val="24"/>
+        </w:rPr>
+        <w:t>2.1 Existing-Installation Detection (FR-36)</w:t>
+      </w:r>
+      <w:bookmarkEnd w:id="31"/>
+    </w:p>
+    <w:p>
+      <w:r>
+        <w:rPr>
+          <w:color w:val="000000"/>
+          <w:sz w:val="20"/>
+          <w:szCs w:val="20"/>
+        </w:rPr>
+        <w:t>Before the Inno Setup wizard appears, the installer executes a three-branch detection routine:</w:t>
+      </w:r>
+    </w:p>
+    <w:p>
+      <w:pPr>
+        <w:pStyle w:val="ListParagraph"/>
+        <w:numPr>
+          <w:ilvl w:val="0"/>
+          <w:numId w:val="2"/>
+        </w:numPr>
+        <w:spacing w:after="60"/>
+      </w:pPr>
+      <w:r>
+        <w:t xml:space="preserve">Registry lookup — GetUninstallString reads HKLM\Software\Microsoft\Windows\CurrentVersion\Uninstall\{AppId}_is1 for the uninstall string; falls back to HKCU if the HKLM key is absent. IsAlreadyInstalled returns True when the string is non-empty.</w:t>
+      </w:r>
+    </w:p>
+    <w:p>
+      <w:pPr>
+        <w:pStyle w:val="ListParagraph"/>
+        <w:numPr>
+          <w:ilvl w:val="0"/>
+          <w:numId w:val="2"/>
+        </w:numPr>
+        <w:spacing w:after="60"/>
+      </w:pPr>
+      <w:r>
+        <w:t xml:space="preserve">InitializeSetup hook — Inno Setup calls this before showing any UI. If IsAlreadyInstalled is True, a message box with Yes / No / Cancel buttons is displayed.</w:t>
+      </w:r>
+    </w:p>
+    <w:p>
+      <w:pPr>
+        <w:pStyle w:val="ListParagraph"/>
+        <w:numPr>
+          <w:ilvl w:val="0"/>
+          <w:numId w:val="2"/>
+        </w:numPr>
+        <w:spacing w:after="60"/>
+      </w:pPr>
+      <w:r>
+        <w:t xml:space="preserve">Three-branch logic — Yes: installer proceeds and overwrites files in-place. No: existing uninstaller runs silently, setup exits without reinstalling. Cancel: setup exits immediately with no changes.</w:t>
+      </w:r>
+    </w:p>
+    <w:p/>
+    <w:p>
+      <w:r>
+        <w:br w:type="page"/>
+      </w:r>
+    </w:p>
+    <w:p>
+      <w:pPr>
+        <w:pStyle w:val="Heading1"/>
+      </w:pPr>
+      <w:bookmarkStart w:id="4" w:name="_Toc232196870"/>
+      <w:r>
+        <w:t>3. Scope</w:t>
       </w:r>
       <w:bookmarkEnd w:id="4"/>
     </w:p>
@@ -1944,9 +1365,9 @@
       <w:pPr>
         <w:pStyle w:val="Heading2"/>
       </w:pPr>
-      <w:bookmarkStart w:id="5" w:name="_Toc232196931"/>
+      <w:bookmarkStart w:id="5" w:name="_Toc232196871"/>
       <w:r>
-        <w:t>2.1 In Scope</w:t>
+        <w:t>3.1 In Scope</w:t>
       </w:r>
       <w:bookmarkEnd w:id="5"/>
     </w:p>
@@ -2045,9 +1466,9 @@
       <w:pPr>
         <w:pStyle w:val="Heading2"/>
       </w:pPr>
-      <w:bookmarkStart w:id="6" w:name="_Toc232196932"/>
+      <w:bookmarkStart w:id="6" w:name="_Toc232196872"/>
       <w:r>
-        <w:t>2.2 Out of Scope</w:t>
+        <w:t>3.2 Out of Scope</w:t>
       </w:r>
       <w:bookmarkEnd w:id="6"/>
     </w:p>
@@ -2130,10 +1551,9 @@
       <w:pPr>
         <w:pStyle w:val="Heading1"/>
       </w:pPr>
-      <w:bookmarkStart w:id="7" w:name="_Toc232196933"/>
+      <w:bookmarkStart w:id="7" w:name="_Toc232196873"/>
       <w:r>
-        <w:lastRenderedPageBreak/>
-        <w:t>3. Stakeholders</w:t>
+        <w:t>4. Stakeholders</w:t>
       </w:r>
       <w:bookmarkEnd w:id="7"/>
     </w:p>
@@ -2152,7 +1572,7 @@
           <w:left w:w="10" w:type="dxa"/>
           <w:right w:w="10" w:type="dxa"/>
         </w:tblCellMar>
-        <w:tblLook w:val="04A0" w:firstRow="1" w:lastRow="0" w:firstColumn="1" w:lastColumn="0" w:noHBand="0" w:noVBand="1"/>
+        <w:tblLook w:val="0000" w:firstRow="0" w:lastRow="0" w:firstColumn="0" w:lastColumn="0" w:noHBand="0" w:noVBand="0"/>
       </w:tblPr>
       <w:tblGrid>
         <w:gridCol w:w="2400"/>
@@ -2569,9 +1989,9 @@
       <w:pPr>
         <w:pStyle w:val="Heading1"/>
       </w:pPr>
-      <w:bookmarkStart w:id="8" w:name="_Toc232196934"/>
+      <w:bookmarkStart w:id="8" w:name="_Toc232196874"/>
       <w:r>
-        <w:t>4. Business Objectives</w:t>
+        <w:t>5. Business Objectives</w:t>
       </w:r>
       <w:bookmarkEnd w:id="8"/>
     </w:p>
@@ -2598,7 +2018,7 @@
           <w:left w:w="10" w:type="dxa"/>
           <w:right w:w="10" w:type="dxa"/>
         </w:tblCellMar>
-        <w:tblLook w:val="04A0" w:firstRow="1" w:lastRow="0" w:firstColumn="1" w:lastColumn="0" w:noHBand="0" w:noVBand="1"/>
+        <w:tblLook w:val="0000" w:firstRow="0" w:lastRow="0" w:firstColumn="0" w:lastColumn="0" w:noHBand="0" w:noVBand="0"/>
       </w:tblPr>
       <w:tblGrid>
         <w:gridCol w:w="2400"/>
@@ -3015,9 +2435,9 @@
       <w:pPr>
         <w:pStyle w:val="Heading1"/>
       </w:pPr>
-      <w:bookmarkStart w:id="9" w:name="_Toc232196935"/>
+      <w:bookmarkStart w:id="9" w:name="_Toc232196875"/>
       <w:r>
-        <w:t>5. Functional Requirements</w:t>
+        <w:t>6. Functional Requirements</w:t>
       </w:r>
       <w:bookmarkEnd w:id="9"/>
     </w:p>
@@ -3025,9 +2445,9 @@
       <w:pPr>
         <w:pStyle w:val="Heading2"/>
       </w:pPr>
-      <w:bookmarkStart w:id="10" w:name="_Toc232196936"/>
+      <w:bookmarkStart w:id="10" w:name="_Toc232196876"/>
       <w:r>
-        <w:t>5.1 Drive and Folder Tree</w:t>
+        <w:t>6.1 Drive and Folder Tree</w:t>
       </w:r>
       <w:bookmarkEnd w:id="10"/>
     </w:p>
@@ -3046,7 +2466,7 @@
           <w:left w:w="10" w:type="dxa"/>
           <w:right w:w="10" w:type="dxa"/>
         </w:tblCellMar>
-        <w:tblLook w:val="04A0" w:firstRow="1" w:lastRow="0" w:firstColumn="1" w:lastColumn="0" w:noHBand="0" w:noVBand="1"/>
+        <w:tblLook w:val="0000" w:firstRow="0" w:lastRow="0" w:firstColumn="0" w:lastColumn="0" w:noHBand="0" w:noVBand="0"/>
       </w:tblPr>
       <w:tblGrid>
         <w:gridCol w:w="720"/>
@@ -3792,9 +3212,9 @@
       <w:pPr>
         <w:pStyle w:val="Heading2"/>
       </w:pPr>
-      <w:bookmarkStart w:id="11" w:name="_Toc232196937"/>
+      <w:bookmarkStart w:id="11" w:name="_Toc232196877"/>
       <w:r>
-        <w:t>5.2 File List</w:t>
+        <w:t>6.2 File List</w:t>
       </w:r>
       <w:bookmarkEnd w:id="11"/>
     </w:p>
@@ -3813,7 +3233,7 @@
           <w:left w:w="10" w:type="dxa"/>
           <w:right w:w="10" w:type="dxa"/>
         </w:tblCellMar>
-        <w:tblLook w:val="04A0" w:firstRow="1" w:lastRow="0" w:firstColumn="1" w:lastColumn="0" w:noHBand="0" w:noVBand="1"/>
+        <w:tblLook w:val="0000" w:firstRow="0" w:lastRow="0" w:firstColumn="0" w:lastColumn="0" w:noHBand="0" w:noVBand="0"/>
       </w:tblPr>
       <w:tblGrid>
         <w:gridCol w:w="720"/>
@@ -4559,9 +3979,9 @@
       <w:pPr>
         <w:pStyle w:val="Heading2"/>
       </w:pPr>
-      <w:bookmarkStart w:id="12" w:name="_Toc232196938"/>
+      <w:bookmarkStart w:id="12" w:name="_Toc232196878"/>
       <w:r>
-        <w:t>5.3 Navigation</w:t>
+        <w:t>6.3 Navigation</w:t>
       </w:r>
       <w:bookmarkEnd w:id="12"/>
     </w:p>
@@ -4580,7 +4000,7 @@
           <w:left w:w="10" w:type="dxa"/>
           <w:right w:w="10" w:type="dxa"/>
         </w:tblCellMar>
-        <w:tblLook w:val="04A0" w:firstRow="1" w:lastRow="0" w:firstColumn="1" w:lastColumn="0" w:noHBand="0" w:noVBand="1"/>
+        <w:tblLook w:val="0000" w:firstRow="0" w:lastRow="0" w:firstColumn="0" w:lastColumn="0" w:noHBand="0" w:noVBand="0"/>
       </w:tblPr>
       <w:tblGrid>
         <w:gridCol w:w="720"/>
@@ -5326,9 +4746,9 @@
       <w:pPr>
         <w:pStyle w:val="Heading2"/>
       </w:pPr>
-      <w:bookmarkStart w:id="13" w:name="_Toc232196939"/>
+      <w:bookmarkStart w:id="13" w:name="_Toc232196879"/>
       <w:r>
-        <w:t>5.4 Background Size Scanning</w:t>
+        <w:t>6.4 Background Size Scanning</w:t>
       </w:r>
       <w:bookmarkEnd w:id="13"/>
     </w:p>
@@ -5347,7 +4767,7 @@
           <w:left w:w="10" w:type="dxa"/>
           <w:right w:w="10" w:type="dxa"/>
         </w:tblCellMar>
-        <w:tblLook w:val="04A0" w:firstRow="1" w:lastRow="0" w:firstColumn="1" w:lastColumn="0" w:noHBand="0" w:noVBand="1"/>
+        <w:tblLook w:val="0000" w:firstRow="0" w:lastRow="0" w:firstColumn="0" w:lastColumn="0" w:noHBand="0" w:noVBand="0"/>
       </w:tblPr>
       <w:tblGrid>
         <w:gridCol w:w="720"/>
@@ -5973,9 +5393,9 @@
       <w:pPr>
         <w:pStyle w:val="Heading2"/>
       </w:pPr>
-      <w:bookmarkStart w:id="14" w:name="_Toc232196940"/>
+      <w:bookmarkStart w:id="14" w:name="_Toc232196880"/>
       <w:r>
-        <w:t>5.5 Filtering</w:t>
+        <w:t>6.5 Filtering</w:t>
       </w:r>
       <w:bookmarkEnd w:id="14"/>
     </w:p>
@@ -5994,7 +5414,7 @@
           <w:left w:w="10" w:type="dxa"/>
           <w:right w:w="10" w:type="dxa"/>
         </w:tblCellMar>
-        <w:tblLook w:val="04A0" w:firstRow="1" w:lastRow="0" w:firstColumn="1" w:lastColumn="0" w:noHBand="0" w:noVBand="1"/>
+        <w:tblLook w:val="0000" w:firstRow="0" w:lastRow="0" w:firstColumn="0" w:lastColumn="0" w:noHBand="0" w:noVBand="0"/>
       </w:tblPr>
       <w:tblGrid>
         <w:gridCol w:w="720"/>
@@ -6860,9 +6280,9 @@
       <w:pPr>
         <w:pStyle w:val="Heading2"/>
       </w:pPr>
-      <w:bookmarkStart w:id="15" w:name="_Toc232196941"/>
+      <w:bookmarkStart w:id="15" w:name="_Toc232196881"/>
       <w:r>
-        <w:t>5.6 Sorting</w:t>
+        <w:t>6.6 Sorting</w:t>
       </w:r>
       <w:bookmarkEnd w:id="15"/>
     </w:p>
@@ -6881,7 +6301,7 @@
           <w:left w:w="10" w:type="dxa"/>
           <w:right w:w="10" w:type="dxa"/>
         </w:tblCellMar>
-        <w:tblLook w:val="04A0" w:firstRow="1" w:lastRow="0" w:firstColumn="1" w:lastColumn="0" w:noHBand="0" w:noVBand="1"/>
+        <w:tblLook w:val="0000" w:firstRow="0" w:lastRow="0" w:firstColumn="0" w:lastColumn="0" w:noHBand="0" w:noVBand="0"/>
       </w:tblPr>
       <w:tblGrid>
         <w:gridCol w:w="720"/>
@@ -7387,9 +6807,9 @@
       <w:pPr>
         <w:pStyle w:val="Heading2"/>
       </w:pPr>
-      <w:bookmarkStart w:id="16" w:name="_Toc232196942"/>
+      <w:bookmarkStart w:id="16" w:name="_Toc232196882"/>
       <w:r>
-        <w:t>5.7 File Operations</w:t>
+        <w:t>6.7 File Operations</w:t>
       </w:r>
       <w:bookmarkEnd w:id="16"/>
     </w:p>
@@ -7408,7 +6828,7 @@
           <w:left w:w="10" w:type="dxa"/>
           <w:right w:w="10" w:type="dxa"/>
         </w:tblCellMar>
-        <w:tblLook w:val="04A0" w:firstRow="1" w:lastRow="0" w:firstColumn="1" w:lastColumn="0" w:noHBand="0" w:noVBand="1"/>
+        <w:tblLook w:val="0000" w:firstRow="0" w:lastRow="0" w:firstColumn="0" w:lastColumn="0" w:noHBand="0" w:noVBand="0"/>
       </w:tblPr>
       <w:tblGrid>
         <w:gridCol w:w="720"/>
@@ -8034,9 +7454,9 @@
       <w:pPr>
         <w:pStyle w:val="Heading2"/>
       </w:pPr>
-      <w:bookmarkStart w:id="17" w:name="_Toc232196943"/>
+      <w:bookmarkStart w:id="17" w:name="_Toc232196883"/>
       <w:r>
-        <w:t>5.8 Live File System Monitoring</w:t>
+        <w:t>6.8 Live File System Monitoring</w:t>
       </w:r>
       <w:bookmarkEnd w:id="17"/>
     </w:p>
@@ -8055,7 +7475,7 @@
           <w:left w:w="10" w:type="dxa"/>
           <w:right w:w="10" w:type="dxa"/>
         </w:tblCellMar>
-        <w:tblLook w:val="04A0" w:firstRow="1" w:lastRow="0" w:firstColumn="1" w:lastColumn="0" w:noHBand="0" w:noVBand="1"/>
+        <w:tblLook w:val="0000" w:firstRow="0" w:lastRow="0" w:firstColumn="0" w:lastColumn="0" w:noHBand="0" w:noVBand="0"/>
       </w:tblPr>
       <w:tblGrid>
         <w:gridCol w:w="720"/>
@@ -8441,9 +7861,9 @@
       <w:pPr>
         <w:pStyle w:val="Heading2"/>
       </w:pPr>
-      <w:bookmarkStart w:id="18" w:name="_Toc232196944"/>
+      <w:bookmarkStart w:id="18" w:name="_Toc232196884"/>
       <w:r>
-        <w:t>5.9 Settings and Persistence</w:t>
+        <w:t>6.9 Settings and Persistence</w:t>
       </w:r>
       <w:bookmarkEnd w:id="18"/>
     </w:p>
@@ -8462,7 +7882,7 @@
           <w:left w:w="10" w:type="dxa"/>
           <w:right w:w="10" w:type="dxa"/>
         </w:tblCellMar>
-        <w:tblLook w:val="04A0" w:firstRow="1" w:lastRow="0" w:firstColumn="1" w:lastColumn="0" w:noHBand="0" w:noVBand="1"/>
+        <w:tblLook w:val="0000" w:firstRow="0" w:lastRow="0" w:firstColumn="0" w:lastColumn="0" w:noHBand="0" w:noVBand="0"/>
       </w:tblPr>
       <w:tblGrid>
         <w:gridCol w:w="720"/>
@@ -8961,6 +8381,132 @@
     </w:tbl>
     <w:p>
       <w:pPr>
+        <w:pStyle w:val="Heading2"/>
+        <w:spacing w:after="100"/>
+      </w:pPr>
+      <w:bookmarkStart w:id="32" w:name="_Toc232196902"/>
+      <w:r>
+        <w:rPr>
+          <w:sz w:val="24"/>
+          <w:szCs w:val="24"/>
+        </w:rPr>
+        <w:t>6.10 Installer</w:t>
+      </w:r>
+      <w:bookmarkEnd w:id="32"/>
+    </w:p>
+    <w:tbl>
+      <w:tblPr>
+        <w:tblStyle w:val="TableGrid"/>
+        <w:tblW w:w="9360" w:type="dxa"/>
+        <w:tblBorders>
+          <w:top w:val="single" w:sz="4" w:space="0" w:color="auto"/>
+          <w:left w:val="single" w:sz="4" w:space="0" w:color="auto"/>
+          <w:bottom w:val="single" w:sz="4" w:space="0" w:color="auto"/>
+          <w:right w:val="single" w:sz="4" w:space="0" w:color="auto"/>
+          <w:insideH w:val="single" w:sz="4" w:space="0" w:color="auto"/>
+          <w:insideV w:val="single" w:sz="4" w:space="0" w:color="auto"/>
+        </w:tblBorders>
+      </w:tblPr>
+      <w:tblGrid>
+        <w:gridCol w:w="1440"/>
+        <w:gridCol w:w="3120"/>
+        <w:gridCol w:w="4800"/>
+      </w:tblGrid>
+      <w:tr>
+        <w:tc>
+          <w:tcPr>
+            <w:tcW w:w="1440" w:type="dxa"/>
+            <w:shd w:val="clear" w:color="auto" w:fill="1F4E79"/>
+          </w:tcPr>
+          <w:p>
+            <w:r>
+              <w:rPr>
+                <w:b/>
+                <w:color w:val="FFFFFF"/>
+                <w:sz w:val="18"/>
+              </w:rPr>
+              <w:t>ID</w:t>
+            </w:r>
+          </w:p>
+        </w:tc>
+        <w:tc>
+          <w:tcPr>
+            <w:tcW w:w="3120" w:type="dxa"/>
+            <w:shd w:val="clear" w:color="auto" w:fill="1F4E79"/>
+          </w:tcPr>
+          <w:p>
+            <w:r>
+              <w:rPr>
+                <w:b/>
+                <w:color w:val="FFFFFF"/>
+                <w:sz w:val="18"/>
+              </w:rPr>
+              <w:t>Requirement</w:t>
+            </w:r>
+          </w:p>
+        </w:tc>
+        <w:tc>
+          <w:tcPr>
+            <w:tcW w:w="4800" w:type="dxa"/>
+            <w:shd w:val="clear" w:color="auto" w:fill="1F4E79"/>
+          </w:tcPr>
+          <w:p>
+            <w:r>
+              <w:rPr>
+                <w:b/>
+                <w:color w:val="FFFFFF"/>
+                <w:sz w:val="18"/>
+              </w:rPr>
+              <w:t>Description</w:t>
+            </w:r>
+          </w:p>
+        </w:tc>
+      </w:tr>
+      <w:tr>
+        <w:tc>
+          <w:tcPr>
+            <w:tcW w:w="1440" w:type="dxa"/>
+          </w:tcPr>
+          <w:p>
+            <w:r>
+              <w:rPr>
+                <w:sz w:val="18"/>
+              </w:rPr>
+              <w:t>FR-36</w:t>
+            </w:r>
+          </w:p>
+        </w:tc>
+        <w:tc>
+          <w:tcPr>
+            <w:tcW w:w="3120" w:type="dxa"/>
+          </w:tcPr>
+          <w:p>
+            <w:r>
+              <w:rPr>
+                <w:sz w:val="18"/>
+              </w:rPr>
+              <w:t>Existing-installation detection</w:t>
+            </w:r>
+          </w:p>
+        </w:tc>
+        <w:tc>
+          <w:tcPr>
+            <w:tcW w:w="4800" w:type="dxa"/>
+          </w:tcPr>
+          <w:p>
+            <w:r>
+              <w:rPr>
+                <w:sz w:val="18"/>
+              </w:rPr>
+              <w:t xml:space="preserve">The installer shall detect an existing installation via registry lookup (HKLM then HKCU). When an existing install is found, the user shall be prompted with Yes / No / Cancel: Yes overwrites in-place; No silently uninstalls then exits; Cancel aborts with no changes. When no prior install is found the wizard proceeds without prompting.</w:t>
+            </w:r>
+          </w:p>
+        </w:tc>
+      </w:tr>
+    </w:tbl>
+    <w:p/>
+    <w:p>
+      <w:pPr>
         <w:spacing w:after="120"/>
       </w:pPr>
     </w:p>
@@ -8973,9 +8519,9 @@
       <w:pPr>
         <w:pStyle w:val="Heading1"/>
       </w:pPr>
-      <w:bookmarkStart w:id="19" w:name="_Toc232196945"/>
+      <w:bookmarkStart w:id="19" w:name="_Toc232196885"/>
       <w:r>
-        <w:t>6. Non-Functional Requirements</w:t>
+        <w:t>7. Non-Functional Requirements</w:t>
       </w:r>
       <w:bookmarkEnd w:id="19"/>
     </w:p>
@@ -8994,7 +8540,7 @@
           <w:left w:w="10" w:type="dxa"/>
           <w:right w:w="10" w:type="dxa"/>
         </w:tblCellMar>
-        <w:tblLook w:val="04A0" w:firstRow="1" w:lastRow="0" w:firstColumn="1" w:lastColumn="0" w:noHBand="0" w:noVBand="1"/>
+        <w:tblLook w:val="0000" w:firstRow="0" w:lastRow="0" w:firstColumn="0" w:lastColumn="0" w:noHBand="0" w:noVBand="0"/>
       </w:tblPr>
       <w:tblGrid>
         <w:gridCol w:w="2400"/>
@@ -9741,9 +9287,9 @@
       <w:pPr>
         <w:pStyle w:val="Heading1"/>
       </w:pPr>
-      <w:bookmarkStart w:id="20" w:name="_Toc232196946"/>
+      <w:bookmarkStart w:id="20" w:name="_Toc232196886"/>
       <w:r>
-        <w:t>7. Constraints and Assumptions</w:t>
+        <w:t>8. Constraints and Assumptions</w:t>
       </w:r>
       <w:bookmarkEnd w:id="20"/>
     </w:p>
@@ -9751,9 +9297,9 @@
       <w:pPr>
         <w:pStyle w:val="Heading2"/>
       </w:pPr>
-      <w:bookmarkStart w:id="21" w:name="_Toc232196947"/>
+      <w:bookmarkStart w:id="21" w:name="_Toc232196887"/>
       <w:r>
-        <w:t>7.1 Constraints</w:t>
+        <w:t>8.1 Constraints</w:t>
       </w:r>
       <w:bookmarkEnd w:id="21"/>
     </w:p>
@@ -9813,9 +9359,9 @@
       <w:pPr>
         <w:pStyle w:val="Heading2"/>
       </w:pPr>
-      <w:bookmarkStart w:id="22" w:name="_Toc232196948"/>
+      <w:bookmarkStart w:id="22" w:name="_Toc232196888"/>
       <w:r>
-        <w:t>7.2 Assumptions</w:t>
+        <w:t>8.2 Assumptions</w:t>
       </w:r>
       <w:bookmarkEnd w:id="22"/>
     </w:p>
@@ -9885,11 +9431,769 @@
     <w:p>
       <w:pPr>
         <w:pStyle w:val="Heading1"/>
+      </w:pPr>
+      <w:bookmarkStart w:id="26" w:name="_Toc232196892"/>
+      <w:r>
+        <w:t>9. Glossary</w:t>
+      </w:r>
+      <w:bookmarkEnd w:id="26"/>
+    </w:p>
+    <w:tbl>
+      <w:tblPr>
+        <w:tblW w:w="9360" w:type="dxa"/>
+        <w:tblBorders>
+          <w:top w:val="single" w:sz="4" w:space="0" w:color="auto"/>
+          <w:left w:val="single" w:sz="4" w:space="0" w:color="auto"/>
+          <w:bottom w:val="single" w:sz="4" w:space="0" w:color="auto"/>
+          <w:right w:val="single" w:sz="4" w:space="0" w:color="auto"/>
+          <w:insideH w:val="single" w:sz="4" w:space="0" w:color="auto"/>
+          <w:insideV w:val="single" w:sz="4" w:space="0" w:color="auto"/>
+        </w:tblBorders>
+        <w:tblCellMar>
+          <w:left w:w="10" w:type="dxa"/>
+          <w:right w:w="10" w:type="dxa"/>
+        </w:tblCellMar>
+        <w:tblLook w:val="0000" w:firstRow="0" w:lastRow="0" w:firstColumn="0" w:lastColumn="0" w:noHBand="0" w:noVBand="0"/>
+      </w:tblPr>
+      <w:tblGrid>
+        <w:gridCol w:w="2400"/>
+        <w:gridCol w:w="6960"/>
+      </w:tblGrid>
+      <w:tr>
+        <w:tblPrEx>
+          <w:tblCellMar>
+            <w:top w:w="0" w:type="dxa"/>
+            <w:bottom w:w="0" w:type="dxa"/>
+          </w:tblCellMar>
+        </w:tblPrEx>
+        <w:tc>
+          <w:tcPr>
+            <w:tcW w:w="2400" w:type="dxa"/>
+            <w:tcBorders>
+              <w:top w:val="single" w:sz="1" w:space="0" w:color="1F4E79"/>
+              <w:left w:val="single" w:sz="1" w:space="0" w:color="1F4E79"/>
+              <w:bottom w:val="single" w:sz="1" w:space="0" w:color="1F4E79"/>
+              <w:right w:val="single" w:sz="1" w:space="0" w:color="1F4E79"/>
+            </w:tcBorders>
+            <w:shd w:val="clear" w:color="auto" w:fill="1F4E79"/>
+            <w:tcMar>
+              <w:top w:w="80" w:type="dxa"/>
+              <w:left w:w="120" w:type="dxa"/>
+              <w:bottom w:w="80" w:type="dxa"/>
+              <w:right w:w="120" w:type="dxa"/>
+            </w:tcMar>
+          </w:tcPr>
+          <w:p>
+            <w:r>
+              <w:rPr>
+                <w:b/>
+                <w:bCs/>
+                <w:color w:val="FFFFFF"/>
+                <w:sz w:val="20"/>
+                <w:szCs w:val="20"/>
+              </w:rPr>
+              <w:t>Term</w:t>
+            </w:r>
+          </w:p>
+        </w:tc>
+        <w:tc>
+          <w:tcPr>
+            <w:tcW w:w="6960" w:type="dxa"/>
+            <w:tcBorders>
+              <w:top w:val="single" w:sz="1" w:space="0" w:color="1F4E79"/>
+              <w:left w:val="single" w:sz="1" w:space="0" w:color="1F4E79"/>
+              <w:bottom w:val="single" w:sz="1" w:space="0" w:color="1F4E79"/>
+              <w:right w:val="single" w:sz="1" w:space="0" w:color="1F4E79"/>
+            </w:tcBorders>
+            <w:shd w:val="clear" w:color="auto" w:fill="1F4E79"/>
+            <w:tcMar>
+              <w:top w:w="80" w:type="dxa"/>
+              <w:left w:w="120" w:type="dxa"/>
+              <w:bottom w:w="80" w:type="dxa"/>
+              <w:right w:w="120" w:type="dxa"/>
+            </w:tcMar>
+          </w:tcPr>
+          <w:p>
+            <w:r>
+              <w:rPr>
+                <w:color w:val="FFFFFF"/>
+                <w:sz w:val="20"/>
+                <w:szCs w:val="20"/>
+              </w:rPr>
+              <w:t>Definition</w:t>
+            </w:r>
+          </w:p>
+        </w:tc>
+      </w:tr>
+      <w:tr>
+        <w:tblPrEx>
+          <w:tblCellMar>
+            <w:top w:w="0" w:type="dxa"/>
+            <w:bottom w:w="0" w:type="dxa"/>
+          </w:tblCellMar>
+        </w:tblPrEx>
+        <w:tc>
+          <w:tcPr>
+            <w:tcW w:w="2400" w:type="dxa"/>
+            <w:tcBorders>
+              <w:top w:val="single" w:sz="1" w:space="0" w:color="CCCCCC"/>
+              <w:left w:val="single" w:sz="1" w:space="0" w:color="CCCCCC"/>
+              <w:bottom w:val="single" w:sz="1" w:space="0" w:color="CCCCCC"/>
+              <w:right w:val="single" w:sz="1" w:space="0" w:color="CCCCCC"/>
+            </w:tcBorders>
+            <w:shd w:val="clear" w:color="auto" w:fill="FFFFFF"/>
+            <w:tcMar>
+              <w:top w:w="80" w:type="dxa"/>
+              <w:left w:w="120" w:type="dxa"/>
+              <w:bottom w:w="80" w:type="dxa"/>
+              <w:right w:w="120" w:type="dxa"/>
+            </w:tcMar>
+          </w:tcPr>
+          <w:p>
+            <w:r>
+              <w:rPr>
+                <w:b/>
+                <w:bCs/>
+                <w:color w:val="2E75B6"/>
+                <w:sz w:val="20"/>
+                <w:szCs w:val="20"/>
+              </w:rPr>
+              <w:t>BRS</w:t>
+            </w:r>
+          </w:p>
+        </w:tc>
+        <w:tc>
+          <w:tcPr>
+            <w:tcW w:w="6960" w:type="dxa"/>
+            <w:tcBorders>
+              <w:top w:val="single" w:sz="1" w:space="0" w:color="CCCCCC"/>
+              <w:left w:val="single" w:sz="1" w:space="0" w:color="CCCCCC"/>
+              <w:bottom w:val="single" w:sz="1" w:space="0" w:color="CCCCCC"/>
+              <w:right w:val="single" w:sz="1" w:space="0" w:color="CCCCCC"/>
+            </w:tcBorders>
+            <w:shd w:val="clear" w:color="auto" w:fill="FFFFFF"/>
+            <w:tcMar>
+              <w:top w:w="80" w:type="dxa"/>
+              <w:left w:w="120" w:type="dxa"/>
+              <w:bottom w:w="80" w:type="dxa"/>
+              <w:right w:w="120" w:type="dxa"/>
+            </w:tcMar>
+          </w:tcPr>
+          <w:p>
+            <w:r>
+              <w:rPr>
+                <w:color w:val="000000"/>
+                <w:sz w:val="20"/>
+                <w:szCs w:val="20"/>
+              </w:rPr>
+              <w:t>Business Requirements Specification. A formal document describing what a system must do to satisfy business objectives.</w:t>
+            </w:r>
+          </w:p>
+        </w:tc>
+      </w:tr>
+      <w:tr>
+        <w:tblPrEx>
+          <w:tblCellMar>
+            <w:top w:w="0" w:type="dxa"/>
+            <w:bottom w:w="0" w:type="dxa"/>
+          </w:tblCellMar>
+        </w:tblPrEx>
+        <w:tc>
+          <w:tcPr>
+            <w:tcW w:w="2400" w:type="dxa"/>
+            <w:tcBorders>
+              <w:top w:val="single" w:sz="1" w:space="0" w:color="CCCCCC"/>
+              <w:left w:val="single" w:sz="1" w:space="0" w:color="CCCCCC"/>
+              <w:bottom w:val="single" w:sz="1" w:space="0" w:color="CCCCCC"/>
+              <w:right w:val="single" w:sz="1" w:space="0" w:color="CCCCCC"/>
+            </w:tcBorders>
+            <w:shd w:val="clear" w:color="auto" w:fill="FFFFFF"/>
+            <w:tcMar>
+              <w:top w:w="80" w:type="dxa"/>
+              <w:left w:w="120" w:type="dxa"/>
+              <w:bottom w:w="80" w:type="dxa"/>
+              <w:right w:w="120" w:type="dxa"/>
+            </w:tcMar>
+          </w:tcPr>
+          <w:p>
+            <w:r>
+              <w:rPr>
+                <w:b/>
+                <w:bCs/>
+                <w:color w:val="2E75B6"/>
+                <w:sz w:val="20"/>
+                <w:szCs w:val="20"/>
+              </w:rPr>
+              <w:t>Background Scanning</w:t>
+            </w:r>
+          </w:p>
+        </w:tc>
+        <w:tc>
+          <w:tcPr>
+            <w:tcW w:w="6960" w:type="dxa"/>
+            <w:tcBorders>
+              <w:top w:val="single" w:sz="1" w:space="0" w:color="CCCCCC"/>
+              <w:left w:val="single" w:sz="1" w:space="0" w:color="CCCCCC"/>
+              <w:bottom w:val="single" w:sz="1" w:space="0" w:color="CCCCCC"/>
+              <w:right w:val="single" w:sz="1" w:space="0" w:color="CCCCCC"/>
+            </w:tcBorders>
+            <w:shd w:val="clear" w:color="auto" w:fill="FFFFFF"/>
+            <w:tcMar>
+              <w:top w:w="80" w:type="dxa"/>
+              <w:left w:w="120" w:type="dxa"/>
+              <w:bottom w:w="80" w:type="dxa"/>
+              <w:right w:w="120" w:type="dxa"/>
+            </w:tcMar>
+          </w:tcPr>
+          <w:p>
+            <w:r>
+              <w:rPr>
+                <w:color w:val="000000"/>
+                <w:sz w:val="20"/>
+                <w:szCs w:val="20"/>
+              </w:rPr>
+              <w:t>The concurrent process that recursively traverses every folder on a drive to compute total disk usage, running independently of UI interactions.</w:t>
+            </w:r>
+          </w:p>
+        </w:tc>
+      </w:tr>
+      <w:tr>
+        <w:tblPrEx>
+          <w:tblCellMar>
+            <w:top w:w="0" w:type="dxa"/>
+            <w:bottom w:w="0" w:type="dxa"/>
+          </w:tblCellMar>
+        </w:tblPrEx>
+        <w:tc>
+          <w:tcPr>
+            <w:tcW w:w="2400" w:type="dxa"/>
+            <w:tcBorders>
+              <w:top w:val="single" w:sz="1" w:space="0" w:color="CCCCCC"/>
+              <w:left w:val="single" w:sz="1" w:space="0" w:color="CCCCCC"/>
+              <w:bottom w:val="single" w:sz="1" w:space="0" w:color="CCCCCC"/>
+              <w:right w:val="single" w:sz="1" w:space="0" w:color="CCCCCC"/>
+            </w:tcBorders>
+            <w:shd w:val="clear" w:color="auto" w:fill="FFFFFF"/>
+            <w:tcMar>
+              <w:top w:w="80" w:type="dxa"/>
+              <w:left w:w="120" w:type="dxa"/>
+              <w:bottom w:w="80" w:type="dxa"/>
+              <w:right w:w="120" w:type="dxa"/>
+            </w:tcMar>
+          </w:tcPr>
+          <w:p>
+            <w:r>
+              <w:rPr>
+                <w:b/>
+                <w:bCs/>
+                <w:color w:val="2E75B6"/>
+                <w:sz w:val="20"/>
+                <w:szCs w:val="20"/>
+              </w:rPr>
+              <w:t>Drive Root</w:t>
+            </w:r>
+          </w:p>
+        </w:tc>
+        <w:tc>
+          <w:tcPr>
+            <w:tcW w:w="6960" w:type="dxa"/>
+            <w:tcBorders>
+              <w:top w:val="single" w:sz="1" w:space="0" w:color="CCCCCC"/>
+              <w:left w:val="single" w:sz="1" w:space="0" w:color="CCCCCC"/>
+              <w:bottom w:val="single" w:sz="1" w:space="0" w:color="CCCCCC"/>
+              <w:right w:val="single" w:sz="1" w:space="0" w:color="CCCCCC"/>
+            </w:tcBorders>
+            <w:shd w:val="clear" w:color="auto" w:fill="FFFFFF"/>
+            <w:tcMar>
+              <w:top w:w="80" w:type="dxa"/>
+              <w:left w:w="120" w:type="dxa"/>
+              <w:bottom w:w="80" w:type="dxa"/>
+              <w:right w:w="120" w:type="dxa"/>
+            </w:tcMar>
+          </w:tcPr>
+          <w:p>
+            <w:r>
+              <w:rPr>
+                <w:color w:val="000000"/>
+                <w:sz w:val="20"/>
+                <w:szCs w:val="20"/>
+              </w:rPr>
+              <w:t>The top-level directory of a storage volume, e.g., C:\.</w:t>
+            </w:r>
+          </w:p>
+        </w:tc>
+      </w:tr>
+      <w:tr>
+        <w:tblPrEx>
+          <w:tblCellMar>
+            <w:top w:w="0" w:type="dxa"/>
+            <w:bottom w:w="0" w:type="dxa"/>
+          </w:tblCellMar>
+        </w:tblPrEx>
+        <w:tc>
+          <w:tcPr>
+            <w:tcW w:w="2400" w:type="dxa"/>
+            <w:tcBorders>
+              <w:top w:val="single" w:sz="1" w:space="0" w:color="CCCCCC"/>
+              <w:left w:val="single" w:sz="1" w:space="0" w:color="CCCCCC"/>
+              <w:bottom w:val="single" w:sz="1" w:space="0" w:color="CCCCCC"/>
+              <w:right w:val="single" w:sz="1" w:space="0" w:color="CCCCCC"/>
+            </w:tcBorders>
+            <w:shd w:val="clear" w:color="auto" w:fill="FFFFFF"/>
+            <w:tcMar>
+              <w:top w:w="80" w:type="dxa"/>
+              <w:left w:w="120" w:type="dxa"/>
+              <w:bottom w:w="80" w:type="dxa"/>
+              <w:right w:w="120" w:type="dxa"/>
+            </w:tcMar>
+          </w:tcPr>
+          <w:p>
+            <w:r>
+              <w:rPr>
+                <w:b/>
+                <w:bCs/>
+                <w:color w:val="2E75B6"/>
+                <w:sz w:val="20"/>
+                <w:szCs w:val="20"/>
+              </w:rPr>
+              <w:t>Filter</w:t>
+            </w:r>
+          </w:p>
+        </w:tc>
+        <w:tc>
+          <w:tcPr>
+            <w:tcW w:w="6960" w:type="dxa"/>
+            <w:tcBorders>
+              <w:top w:val="single" w:sz="1" w:space="0" w:color="CCCCCC"/>
+              <w:left w:val="single" w:sz="1" w:space="0" w:color="CCCCCC"/>
+              <w:bottom w:val="single" w:sz="1" w:space="0" w:color="CCCCCC"/>
+              <w:right w:val="single" w:sz="1" w:space="0" w:color="CCCCCC"/>
+            </w:tcBorders>
+            <w:shd w:val="clear" w:color="auto" w:fill="FFFFFF"/>
+            <w:tcMar>
+              <w:top w:w="80" w:type="dxa"/>
+              <w:left w:w="120" w:type="dxa"/>
+              <w:bottom w:w="80" w:type="dxa"/>
+              <w:right w:w="120" w:type="dxa"/>
+            </w:tcMar>
+          </w:tcPr>
+          <w:p>
+            <w:r>
+              <w:rPr>
+                <w:color w:val="000000"/>
+                <w:sz w:val="20"/>
+                <w:szCs w:val="20"/>
+              </w:rPr>
+              <w:t>A wildcard pattern (or semicolon-separated list of patterns) entered in the toolbar Filter box that restricts which files are shown in the file list.</w:t>
+            </w:r>
+          </w:p>
+        </w:tc>
+      </w:tr>
+      <w:tr>
+        <w:tblPrEx>
+          <w:tblCellMar>
+            <w:top w:w="0" w:type="dxa"/>
+            <w:bottom w:w="0" w:type="dxa"/>
+          </w:tblCellMar>
+        </w:tblPrEx>
+        <w:tc>
+          <w:tcPr>
+            <w:tcW w:w="2400" w:type="dxa"/>
+            <w:tcBorders>
+              <w:top w:val="single" w:sz="1" w:space="0" w:color="CCCCCC"/>
+              <w:left w:val="single" w:sz="1" w:space="0" w:color="CCCCCC"/>
+              <w:bottom w:val="single" w:sz="1" w:space="0" w:color="CCCCCC"/>
+              <w:right w:val="single" w:sz="1" w:space="0" w:color="CCCCCC"/>
+            </w:tcBorders>
+            <w:shd w:val="clear" w:color="auto" w:fill="FFFFFF"/>
+            <w:tcMar>
+              <w:top w:w="80" w:type="dxa"/>
+              <w:left w:w="120" w:type="dxa"/>
+              <w:bottom w:w="80" w:type="dxa"/>
+              <w:right w:w="120" w:type="dxa"/>
+            </w:tcMar>
+          </w:tcPr>
+          <w:p>
+            <w:r>
+              <w:rPr>
+                <w:b/>
+                <w:bCs/>
+                <w:color w:val="2E75B6"/>
+                <w:sz w:val="20"/>
+                <w:szCs w:val="20"/>
+              </w:rPr>
+              <w:t>Framework-Dependent</w:t>
+            </w:r>
+          </w:p>
+        </w:tc>
+        <w:tc>
+          <w:tcPr>
+            <w:tcW w:w="6960" w:type="dxa"/>
+            <w:tcBorders>
+              <w:top w:val="single" w:sz="1" w:space="0" w:color="CCCCCC"/>
+              <w:left w:val="single" w:sz="1" w:space="0" w:color="CCCCCC"/>
+              <w:bottom w:val="single" w:sz="1" w:space="0" w:color="CCCCCC"/>
+              <w:right w:val="single" w:sz="1" w:space="0" w:color="CCCCCC"/>
+            </w:tcBorders>
+            <w:shd w:val="clear" w:color="auto" w:fill="FFFFFF"/>
+            <w:tcMar>
+              <w:top w:w="80" w:type="dxa"/>
+              <w:left w:w="120" w:type="dxa"/>
+              <w:bottom w:w="80" w:type="dxa"/>
+              <w:right w:w="120" w:type="dxa"/>
+            </w:tcMar>
+          </w:tcPr>
+          <w:p>
+            <w:r>
+              <w:rPr>
+                <w:color w:val="000000"/>
+                <w:sz w:val="20"/>
+                <w:szCs w:val="20"/>
+              </w:rPr>
+              <w:t>A deployment model where the .NET runtime must be pre-installed on the target machine separately from the application binary.</w:t>
+            </w:r>
+          </w:p>
+        </w:tc>
+      </w:tr>
+      <w:tr>
+        <w:tblPrEx>
+          <w:tblCellMar>
+            <w:top w:w="0" w:type="dxa"/>
+            <w:bottom w:w="0" w:type="dxa"/>
+          </w:tblCellMar>
+        </w:tblPrEx>
+        <w:tc>
+          <w:tcPr>
+            <w:tcW w:w="2400" w:type="dxa"/>
+            <w:tcBorders>
+              <w:top w:val="single" w:sz="1" w:space="0" w:color="CCCCCC"/>
+              <w:left w:val="single" w:sz="1" w:space="0" w:color="CCCCCC"/>
+              <w:bottom w:val="single" w:sz="1" w:space="0" w:color="CCCCCC"/>
+              <w:right w:val="single" w:sz="1" w:space="0" w:color="CCCCCC"/>
+            </w:tcBorders>
+            <w:shd w:val="clear" w:color="auto" w:fill="FFFFFF"/>
+            <w:tcMar>
+              <w:top w:w="80" w:type="dxa"/>
+              <w:left w:w="120" w:type="dxa"/>
+              <w:bottom w:w="80" w:type="dxa"/>
+              <w:right w:w="120" w:type="dxa"/>
+            </w:tcMar>
+          </w:tcPr>
+          <w:p>
+            <w:r>
+              <w:rPr>
+                <w:b/>
+                <w:bCs/>
+                <w:color w:val="2E75B6"/>
+                <w:sz w:val="20"/>
+                <w:szCs w:val="20"/>
+              </w:rPr>
+              <w:t>Self-Contained</w:t>
+            </w:r>
+          </w:p>
+        </w:tc>
+        <w:tc>
+          <w:tcPr>
+            <w:tcW w:w="6960" w:type="dxa"/>
+            <w:tcBorders>
+              <w:top w:val="single" w:sz="1" w:space="0" w:color="CCCCCC"/>
+              <w:left w:val="single" w:sz="1" w:space="0" w:color="CCCCCC"/>
+              <w:bottom w:val="single" w:sz="1" w:space="0" w:color="CCCCCC"/>
+              <w:right w:val="single" w:sz="1" w:space="0" w:color="CCCCCC"/>
+            </w:tcBorders>
+            <w:shd w:val="clear" w:color="auto" w:fill="FFFFFF"/>
+            <w:tcMar>
+              <w:top w:w="80" w:type="dxa"/>
+              <w:left w:w="120" w:type="dxa"/>
+              <w:bottom w:w="80" w:type="dxa"/>
+              <w:right w:w="120" w:type="dxa"/>
+            </w:tcMar>
+          </w:tcPr>
+          <w:p>
+            <w:r>
+              <w:rPr>
+                <w:color w:val="000000"/>
+                <w:sz w:val="20"/>
+                <w:szCs w:val="20"/>
+              </w:rPr>
+              <w:t>A deployment model where the .NET runtime is bundled inside the application executable, requiring no separate runtime installation.</w:t>
+            </w:r>
+          </w:p>
+        </w:tc>
+      </w:tr>
+      <w:tr>
+        <w:tblPrEx>
+          <w:tblCellMar>
+            <w:top w:w="0" w:type="dxa"/>
+            <w:bottom w:w="0" w:type="dxa"/>
+          </w:tblCellMar>
+        </w:tblPrEx>
+        <w:tc>
+          <w:tcPr>
+            <w:tcW w:w="2400" w:type="dxa"/>
+            <w:tcBorders>
+              <w:top w:val="single" w:sz="1" w:space="0" w:color="CCCCCC"/>
+              <w:left w:val="single" w:sz="1" w:space="0" w:color="CCCCCC"/>
+              <w:bottom w:val="single" w:sz="1" w:space="0" w:color="CCCCCC"/>
+              <w:right w:val="single" w:sz="1" w:space="0" w:color="CCCCCC"/>
+            </w:tcBorders>
+            <w:shd w:val="clear" w:color="auto" w:fill="FFFFFF"/>
+            <w:tcMar>
+              <w:top w:w="80" w:type="dxa"/>
+              <w:left w:w="120" w:type="dxa"/>
+              <w:bottom w:w="80" w:type="dxa"/>
+              <w:right w:w="120" w:type="dxa"/>
+            </w:tcMar>
+          </w:tcPr>
+          <w:p>
+            <w:r>
+              <w:rPr>
+                <w:b/>
+                <w:bCs/>
+                <w:color w:val="2E75B6"/>
+                <w:sz w:val="20"/>
+                <w:szCs w:val="20"/>
+              </w:rPr>
+              <w:t>This PC View</w:t>
+            </w:r>
+          </w:p>
+        </w:tc>
+        <w:tc>
+          <w:tcPr>
+            <w:tcW w:w="6960" w:type="dxa"/>
+            <w:tcBorders>
+              <w:top w:val="single" w:sz="1" w:space="0" w:color="CCCCCC"/>
+              <w:left w:val="single" w:sz="1" w:space="0" w:color="CCCCCC"/>
+              <w:bottom w:val="single" w:sz="1" w:space="0" w:color="CCCCCC"/>
+              <w:right w:val="single" w:sz="1" w:space="0" w:color="CCCCCC"/>
+            </w:tcBorders>
+            <w:shd w:val="clear" w:color="auto" w:fill="FFFFFF"/>
+            <w:tcMar>
+              <w:top w:w="80" w:type="dxa"/>
+              <w:left w:w="120" w:type="dxa"/>
+              <w:bottom w:w="80" w:type="dxa"/>
+              <w:right w:w="120" w:type="dxa"/>
+            </w:tcMar>
+          </w:tcPr>
+          <w:p>
+            <w:r>
+              <w:rPr>
+                <w:color w:val="000000"/>
+                <w:sz w:val="20"/>
+                <w:szCs w:val="20"/>
+              </w:rPr>
+              <w:t>A special view in the file list that shows all available drives instead of the contents of a specific folder. Reached by pressing Up from a drive root.</w:t>
+            </w:r>
+          </w:p>
+        </w:tc>
+      </w:tr>
+      <w:tr>
+        <w:tblPrEx>
+          <w:tblCellMar>
+            <w:top w:w="0" w:type="dxa"/>
+            <w:bottom w:w="0" w:type="dxa"/>
+          </w:tblCellMar>
+        </w:tblPrEx>
+        <w:tc>
+          <w:tcPr>
+            <w:tcW w:w="2400" w:type="dxa"/>
+            <w:tcBorders>
+              <w:top w:val="single" w:sz="1" w:space="0" w:color="CCCCCC"/>
+              <w:left w:val="single" w:sz="1" w:space="0" w:color="CCCCCC"/>
+              <w:bottom w:val="single" w:sz="1" w:space="0" w:color="CCCCCC"/>
+              <w:right w:val="single" w:sz="1" w:space="0" w:color="CCCCCC"/>
+            </w:tcBorders>
+            <w:shd w:val="clear" w:color="auto" w:fill="FFFFFF"/>
+            <w:tcMar>
+              <w:top w:w="80" w:type="dxa"/>
+              <w:left w:w="120" w:type="dxa"/>
+              <w:bottom w:w="80" w:type="dxa"/>
+              <w:right w:w="120" w:type="dxa"/>
+            </w:tcMar>
+          </w:tcPr>
+          <w:p>
+            <w:r>
+              <w:rPr>
+                <w:b/>
+                <w:bCs/>
+                <w:color w:val="2E75B6"/>
+                <w:sz w:val="20"/>
+                <w:szCs w:val="20"/>
+              </w:rPr>
+              <w:t>WinForms</w:t>
+            </w:r>
+          </w:p>
+        </w:tc>
+        <w:tc>
+          <w:tcPr>
+            <w:tcW w:w="6960" w:type="dxa"/>
+            <w:tcBorders>
+              <w:top w:val="single" w:sz="1" w:space="0" w:color="CCCCCC"/>
+              <w:left w:val="single" w:sz="1" w:space="0" w:color="CCCCCC"/>
+              <w:bottom w:val="single" w:sz="1" w:space="0" w:color="CCCCCC"/>
+              <w:right w:val="single" w:sz="1" w:space="0" w:color="CCCCCC"/>
+            </w:tcBorders>
+            <w:shd w:val="clear" w:color="auto" w:fill="FFFFFF"/>
+            <w:tcMar>
+              <w:top w:w="80" w:type="dxa"/>
+              <w:left w:w="120" w:type="dxa"/>
+              <w:bottom w:w="80" w:type="dxa"/>
+              <w:right w:w="120" w:type="dxa"/>
+            </w:tcMar>
+          </w:tcPr>
+          <w:p>
+            <w:r>
+              <w:rPr>
+                <w:color w:val="000000"/>
+                <w:sz w:val="20"/>
+                <w:szCs w:val="20"/>
+              </w:rPr>
+              <w:t>Windows Forms. A .NET UI framework for building desktop applications on Windows.</w:t>
+            </w:r>
+          </w:p>
+        </w:tc>
+      </w:tr>
+      <w:tr>
+        <w:tblPrEx>
+          <w:tblCellMar>
+            <w:top w:w="0" w:type="dxa"/>
+            <w:bottom w:w="0" w:type="dxa"/>
+          </w:tblCellMar>
+        </w:tblPrEx>
+        <w:tc>
+          <w:tcPr>
+            <w:tcW w:w="2400" w:type="dxa"/>
+            <w:tcBorders>
+              <w:top w:val="single" w:sz="1" w:space="0" w:color="CCCCCC"/>
+              <w:left w:val="single" w:sz="1" w:space="0" w:color="CCCCCC"/>
+              <w:bottom w:val="single" w:sz="1" w:space="0" w:color="CCCCCC"/>
+              <w:right w:val="single" w:sz="1" w:space="0" w:color="CCCCCC"/>
+            </w:tcBorders>
+            <w:shd w:val="clear" w:color="auto" w:fill="FFFFFF"/>
+            <w:tcMar>
+              <w:top w:w="80" w:type="dxa"/>
+              <w:left w:w="120" w:type="dxa"/>
+              <w:bottom w:w="80" w:type="dxa"/>
+              <w:right w:w="120" w:type="dxa"/>
+            </w:tcMar>
+          </w:tcPr>
+          <w:p>
+            <w:r>
+              <w:rPr>
+                <w:b/>
+                <w:bCs/>
+                <w:color w:val="2E75B6"/>
+                <w:sz w:val="20"/>
+                <w:szCs w:val="20"/>
+              </w:rPr>
+              <w:t>Wildcard</w:t>
+            </w:r>
+          </w:p>
+        </w:tc>
+        <w:tc>
+          <w:tcPr>
+            <w:tcW w:w="6960" w:type="dxa"/>
+            <w:tcBorders>
+              <w:top w:val="single" w:sz="1" w:space="0" w:color="CCCCCC"/>
+              <w:left w:val="single" w:sz="1" w:space="0" w:color="CCCCCC"/>
+              <w:bottom w:val="single" w:sz="1" w:space="0" w:color="CCCCCC"/>
+              <w:right w:val="single" w:sz="1" w:space="0" w:color="CCCCCC"/>
+            </w:tcBorders>
+            <w:shd w:val="clear" w:color="auto" w:fill="FFFFFF"/>
+            <w:tcMar>
+              <w:top w:w="80" w:type="dxa"/>
+              <w:left w:w="120" w:type="dxa"/>
+              <w:bottom w:w="80" w:type="dxa"/>
+              <w:right w:w="120" w:type="dxa"/>
+            </w:tcMar>
+          </w:tcPr>
+          <w:p>
+            <w:r>
+              <w:rPr>
+                <w:color w:val="000000"/>
+                <w:sz w:val="20"/>
+                <w:szCs w:val="20"/>
+              </w:rPr>
+              <w:t>A special character used in a filter pattern: * matches zero or more characters; ? matches exactly one character.</w:t>
+            </w:r>
+          </w:p>
+        </w:tc>
+      </w:tr>
+      <w:tr>
+        <w:tblPrEx>
+          <w:tblCellMar>
+            <w:top w:w="0" w:type="dxa"/>
+            <w:bottom w:w="0" w:type="dxa"/>
+          </w:tblCellMar>
+        </w:tblPrEx>
+        <w:tc>
+          <w:tcPr>
+            <w:tcW w:w="2400" w:type="dxa"/>
+            <w:tcBorders>
+              <w:top w:val="single" w:sz="1" w:space="0" w:color="CCCCCC"/>
+              <w:left w:val="single" w:sz="1" w:space="0" w:color="CCCCCC"/>
+              <w:bottom w:val="single" w:sz="1" w:space="0" w:color="CCCCCC"/>
+              <w:right w:val="single" w:sz="1" w:space="0" w:color="CCCCCC"/>
+            </w:tcBorders>
+            <w:shd w:val="clear" w:color="auto" w:fill="FFFFFF"/>
+            <w:tcMar>
+              <w:top w:w="80" w:type="dxa"/>
+              <w:left w:w="120" w:type="dxa"/>
+              <w:bottom w:w="80" w:type="dxa"/>
+              <w:right w:w="120" w:type="dxa"/>
+            </w:tcMar>
+          </w:tcPr>
+          <w:p>
+            <w:r>
+              <w:rPr>
+                <w:b/>
+                <w:bCs/>
+                <w:color w:val="2E75B6"/>
+                <w:sz w:val="20"/>
+                <w:szCs w:val="20"/>
+              </w:rPr>
+              <w:t>Settings File</w:t>
+            </w:r>
+          </w:p>
+        </w:tc>
+        <w:tc>
+          <w:tcPr>
+            <w:tcW w:w="6960" w:type="dxa"/>
+            <w:tcBorders>
+              <w:top w:val="single" w:sz="1" w:space="0" w:color="CCCCCC"/>
+              <w:left w:val="single" w:sz="1" w:space="0" w:color="CCCCCC"/>
+              <w:bottom w:val="single" w:sz="1" w:space="0" w:color="CCCCCC"/>
+              <w:right w:val="single" w:sz="1" w:space="0" w:color="CCCCCC"/>
+            </w:tcBorders>
+            <w:shd w:val="clear" w:color="auto" w:fill="FFFFFF"/>
+            <w:tcMar>
+              <w:top w:w="80" w:type="dxa"/>
+              <w:left w:w="120" w:type="dxa"/>
+              <w:bottom w:w="80" w:type="dxa"/>
+              <w:right w:w="120" w:type="dxa"/>
+            </w:tcMar>
+          </w:tcPr>
+          <w:p>
+            <w:r>
+              <w:rPr>
+                <w:color w:val="000000"/>
+                <w:sz w:val="20"/>
+                <w:szCs w:val="20"/>
+              </w:rPr>
+              <w:t>A JSON file (settings.json) stored in the application directory that persists user preferences between sessions.</w:t>
+            </w:r>
+          </w:p>
+        </w:tc>
+      </w:tr>
+    </w:tbl>
+    <w:p>
+      <w:pPr>
+        <w:pStyle w:val="Heading1"/>
         <w:spacing w:before="320" w:after="160"/>
       </w:pPr>
-      <w:bookmarkStart w:id="23" w:name="_Toc232196949"/>
+      <w:bookmarkStart w:id="23" w:name="_Toc232196889"/>
       <w:r>
-        <w:t>9. Requirements Amendments — Session 4 (2026-06-12)</w:t>
+        <w:t>10. Requirements Amendments — Session 4 (2026-06-12)</w:t>
       </w:r>
       <w:bookmarkEnd w:id="23"/>
     </w:p>
@@ -9909,13 +10213,13 @@
         <w:pStyle w:val="Heading2"/>
         <w:spacing w:after="100"/>
       </w:pPr>
-      <w:bookmarkStart w:id="24" w:name="_Toc232196950"/>
+      <w:bookmarkStart w:id="24" w:name="_Toc232196890"/>
       <w:r>
         <w:rPr>
           <w:sz w:val="24"/>
           <w:szCs w:val="24"/>
         </w:rPr>
-        <w:t>9.1  FR-23 Amendment: Parent Node Filter Bar on Expand</w:t>
+        <w:t>10.1  FR-23 Amendment: Parent Node Filter Bar on Expand</w:t>
       </w:r>
       <w:bookmarkEnd w:id="24"/>
     </w:p>
@@ -9935,13 +10239,13 @@
         <w:pStyle w:val="Heading2"/>
         <w:spacing w:after="100"/>
       </w:pPr>
-      <w:bookmarkStart w:id="25" w:name="_Toc232196951"/>
+      <w:bookmarkStart w:id="25" w:name="_Toc232196891"/>
       <w:r>
         <w:rPr>
           <w:sz w:val="24"/>
           <w:szCs w:val="24"/>
         </w:rPr>
-        <w:t>9.2  NFR-02 Clarification: Targeted Repaint on Filter Completion</w:t>
+        <w:t>10.2  NFR-02 Clarification: Targeted Repaint on Filter Completion</w:t>
       </w:r>
       <w:bookmarkEnd w:id="25"/>
     </w:p>
@@ -9956,764 +10260,6 @@
       </w:r>
     </w:p>
     <w:p/>
-    <w:p>
-      <w:pPr>
-        <w:pStyle w:val="Heading1"/>
-      </w:pPr>
-      <w:bookmarkStart w:id="26" w:name="_Toc232196952"/>
-      <w:r>
-        <w:t>8. Glossary</w:t>
-      </w:r>
-      <w:bookmarkEnd w:id="26"/>
-    </w:p>
-    <w:tbl>
-      <w:tblPr>
-        <w:tblW w:w="9360" w:type="dxa"/>
-        <w:tblBorders>
-          <w:top w:val="single" w:sz="4" w:space="0" w:color="auto"/>
-          <w:left w:val="single" w:sz="4" w:space="0" w:color="auto"/>
-          <w:bottom w:val="single" w:sz="4" w:space="0" w:color="auto"/>
-          <w:right w:val="single" w:sz="4" w:space="0" w:color="auto"/>
-          <w:insideH w:val="single" w:sz="4" w:space="0" w:color="auto"/>
-          <w:insideV w:val="single" w:sz="4" w:space="0" w:color="auto"/>
-        </w:tblBorders>
-        <w:tblCellMar>
-          <w:left w:w="10" w:type="dxa"/>
-          <w:right w:w="10" w:type="dxa"/>
-        </w:tblCellMar>
-        <w:tblLook w:val="04A0" w:firstRow="1" w:lastRow="0" w:firstColumn="1" w:lastColumn="0" w:noHBand="0" w:noVBand="1"/>
-      </w:tblPr>
-      <w:tblGrid>
-        <w:gridCol w:w="2400"/>
-        <w:gridCol w:w="6960"/>
-      </w:tblGrid>
-      <w:tr>
-        <w:tblPrEx>
-          <w:tblCellMar>
-            <w:top w:w="0" w:type="dxa"/>
-            <w:bottom w:w="0" w:type="dxa"/>
-          </w:tblCellMar>
-        </w:tblPrEx>
-        <w:tc>
-          <w:tcPr>
-            <w:tcW w:w="2400" w:type="dxa"/>
-            <w:tcBorders>
-              <w:top w:val="single" w:sz="1" w:space="0" w:color="1F4E79"/>
-              <w:left w:val="single" w:sz="1" w:space="0" w:color="1F4E79"/>
-              <w:bottom w:val="single" w:sz="1" w:space="0" w:color="1F4E79"/>
-              <w:right w:val="single" w:sz="1" w:space="0" w:color="1F4E79"/>
-            </w:tcBorders>
-            <w:shd w:val="clear" w:color="auto" w:fill="1F4E79"/>
-            <w:tcMar>
-              <w:top w:w="80" w:type="dxa"/>
-              <w:left w:w="120" w:type="dxa"/>
-              <w:bottom w:w="80" w:type="dxa"/>
-              <w:right w:w="120" w:type="dxa"/>
-            </w:tcMar>
-          </w:tcPr>
-          <w:p>
-            <w:r>
-              <w:rPr>
-                <w:b/>
-                <w:bCs/>
-                <w:color w:val="FFFFFF"/>
-                <w:sz w:val="20"/>
-                <w:szCs w:val="20"/>
-              </w:rPr>
-              <w:t>Term</w:t>
-            </w:r>
-          </w:p>
-        </w:tc>
-        <w:tc>
-          <w:tcPr>
-            <w:tcW w:w="6960" w:type="dxa"/>
-            <w:tcBorders>
-              <w:top w:val="single" w:sz="1" w:space="0" w:color="1F4E79"/>
-              <w:left w:val="single" w:sz="1" w:space="0" w:color="1F4E79"/>
-              <w:bottom w:val="single" w:sz="1" w:space="0" w:color="1F4E79"/>
-              <w:right w:val="single" w:sz="1" w:space="0" w:color="1F4E79"/>
-            </w:tcBorders>
-            <w:shd w:val="clear" w:color="auto" w:fill="1F4E79"/>
-            <w:tcMar>
-              <w:top w:w="80" w:type="dxa"/>
-              <w:left w:w="120" w:type="dxa"/>
-              <w:bottom w:w="80" w:type="dxa"/>
-              <w:right w:w="120" w:type="dxa"/>
-            </w:tcMar>
-          </w:tcPr>
-          <w:p>
-            <w:r>
-              <w:rPr>
-                <w:color w:val="FFFFFF"/>
-                <w:sz w:val="20"/>
-                <w:szCs w:val="20"/>
-              </w:rPr>
-              <w:t>Definition</w:t>
-            </w:r>
-          </w:p>
-        </w:tc>
-      </w:tr>
-      <w:tr>
-        <w:tblPrEx>
-          <w:tblCellMar>
-            <w:top w:w="0" w:type="dxa"/>
-            <w:bottom w:w="0" w:type="dxa"/>
-          </w:tblCellMar>
-        </w:tblPrEx>
-        <w:tc>
-          <w:tcPr>
-            <w:tcW w:w="2400" w:type="dxa"/>
-            <w:tcBorders>
-              <w:top w:val="single" w:sz="1" w:space="0" w:color="CCCCCC"/>
-              <w:left w:val="single" w:sz="1" w:space="0" w:color="CCCCCC"/>
-              <w:bottom w:val="single" w:sz="1" w:space="0" w:color="CCCCCC"/>
-              <w:right w:val="single" w:sz="1" w:space="0" w:color="CCCCCC"/>
-            </w:tcBorders>
-            <w:shd w:val="clear" w:color="auto" w:fill="FFFFFF"/>
-            <w:tcMar>
-              <w:top w:w="80" w:type="dxa"/>
-              <w:left w:w="120" w:type="dxa"/>
-              <w:bottom w:w="80" w:type="dxa"/>
-              <w:right w:w="120" w:type="dxa"/>
-            </w:tcMar>
-          </w:tcPr>
-          <w:p>
-            <w:r>
-              <w:rPr>
-                <w:b/>
-                <w:bCs/>
-                <w:color w:val="2E75B6"/>
-                <w:sz w:val="20"/>
-                <w:szCs w:val="20"/>
-              </w:rPr>
-              <w:t>BRS</w:t>
-            </w:r>
-          </w:p>
-        </w:tc>
-        <w:tc>
-          <w:tcPr>
-            <w:tcW w:w="6960" w:type="dxa"/>
-            <w:tcBorders>
-              <w:top w:val="single" w:sz="1" w:space="0" w:color="CCCCCC"/>
-              <w:left w:val="single" w:sz="1" w:space="0" w:color="CCCCCC"/>
-              <w:bottom w:val="single" w:sz="1" w:space="0" w:color="CCCCCC"/>
-              <w:right w:val="single" w:sz="1" w:space="0" w:color="CCCCCC"/>
-            </w:tcBorders>
-            <w:shd w:val="clear" w:color="auto" w:fill="FFFFFF"/>
-            <w:tcMar>
-              <w:top w:w="80" w:type="dxa"/>
-              <w:left w:w="120" w:type="dxa"/>
-              <w:bottom w:w="80" w:type="dxa"/>
-              <w:right w:w="120" w:type="dxa"/>
-            </w:tcMar>
-          </w:tcPr>
-          <w:p>
-            <w:r>
-              <w:rPr>
-                <w:color w:val="000000"/>
-                <w:sz w:val="20"/>
-                <w:szCs w:val="20"/>
-              </w:rPr>
-              <w:t>Business Requirements Specification. A formal document describing what a system must do to satisfy business objectives.</w:t>
-            </w:r>
-          </w:p>
-        </w:tc>
-      </w:tr>
-      <w:tr>
-        <w:tblPrEx>
-          <w:tblCellMar>
-            <w:top w:w="0" w:type="dxa"/>
-            <w:bottom w:w="0" w:type="dxa"/>
-          </w:tblCellMar>
-        </w:tblPrEx>
-        <w:tc>
-          <w:tcPr>
-            <w:tcW w:w="2400" w:type="dxa"/>
-            <w:tcBorders>
-              <w:top w:val="single" w:sz="1" w:space="0" w:color="CCCCCC"/>
-              <w:left w:val="single" w:sz="1" w:space="0" w:color="CCCCCC"/>
-              <w:bottom w:val="single" w:sz="1" w:space="0" w:color="CCCCCC"/>
-              <w:right w:val="single" w:sz="1" w:space="0" w:color="CCCCCC"/>
-            </w:tcBorders>
-            <w:shd w:val="clear" w:color="auto" w:fill="FFFFFF"/>
-            <w:tcMar>
-              <w:top w:w="80" w:type="dxa"/>
-              <w:left w:w="120" w:type="dxa"/>
-              <w:bottom w:w="80" w:type="dxa"/>
-              <w:right w:w="120" w:type="dxa"/>
-            </w:tcMar>
-          </w:tcPr>
-          <w:p>
-            <w:r>
-              <w:rPr>
-                <w:b/>
-                <w:bCs/>
-                <w:color w:val="2E75B6"/>
-                <w:sz w:val="20"/>
-                <w:szCs w:val="20"/>
-              </w:rPr>
-              <w:t>Background Scanning</w:t>
-            </w:r>
-          </w:p>
-        </w:tc>
-        <w:tc>
-          <w:tcPr>
-            <w:tcW w:w="6960" w:type="dxa"/>
-            <w:tcBorders>
-              <w:top w:val="single" w:sz="1" w:space="0" w:color="CCCCCC"/>
-              <w:left w:val="single" w:sz="1" w:space="0" w:color="CCCCCC"/>
-              <w:bottom w:val="single" w:sz="1" w:space="0" w:color="CCCCCC"/>
-              <w:right w:val="single" w:sz="1" w:space="0" w:color="CCCCCC"/>
-            </w:tcBorders>
-            <w:shd w:val="clear" w:color="auto" w:fill="FFFFFF"/>
-            <w:tcMar>
-              <w:top w:w="80" w:type="dxa"/>
-              <w:left w:w="120" w:type="dxa"/>
-              <w:bottom w:w="80" w:type="dxa"/>
-              <w:right w:w="120" w:type="dxa"/>
-            </w:tcMar>
-          </w:tcPr>
-          <w:p>
-            <w:r>
-              <w:rPr>
-                <w:color w:val="000000"/>
-                <w:sz w:val="20"/>
-                <w:szCs w:val="20"/>
-              </w:rPr>
-              <w:t>The concurrent process that recursively traverses every folder on a drive to compute total disk usage, running independently of UI interactions.</w:t>
-            </w:r>
-          </w:p>
-        </w:tc>
-      </w:tr>
-      <w:tr>
-        <w:tblPrEx>
-          <w:tblCellMar>
-            <w:top w:w="0" w:type="dxa"/>
-            <w:bottom w:w="0" w:type="dxa"/>
-          </w:tblCellMar>
-        </w:tblPrEx>
-        <w:tc>
-          <w:tcPr>
-            <w:tcW w:w="2400" w:type="dxa"/>
-            <w:tcBorders>
-              <w:top w:val="single" w:sz="1" w:space="0" w:color="CCCCCC"/>
-              <w:left w:val="single" w:sz="1" w:space="0" w:color="CCCCCC"/>
-              <w:bottom w:val="single" w:sz="1" w:space="0" w:color="CCCCCC"/>
-              <w:right w:val="single" w:sz="1" w:space="0" w:color="CCCCCC"/>
-            </w:tcBorders>
-            <w:shd w:val="clear" w:color="auto" w:fill="FFFFFF"/>
-            <w:tcMar>
-              <w:top w:w="80" w:type="dxa"/>
-              <w:left w:w="120" w:type="dxa"/>
-              <w:bottom w:w="80" w:type="dxa"/>
-              <w:right w:w="120" w:type="dxa"/>
-            </w:tcMar>
-          </w:tcPr>
-          <w:p>
-            <w:r>
-              <w:rPr>
-                <w:b/>
-                <w:bCs/>
-                <w:color w:val="2E75B6"/>
-                <w:sz w:val="20"/>
-                <w:szCs w:val="20"/>
-              </w:rPr>
-              <w:t>Drive Root</w:t>
-            </w:r>
-          </w:p>
-        </w:tc>
-        <w:tc>
-          <w:tcPr>
-            <w:tcW w:w="6960" w:type="dxa"/>
-            <w:tcBorders>
-              <w:top w:val="single" w:sz="1" w:space="0" w:color="CCCCCC"/>
-              <w:left w:val="single" w:sz="1" w:space="0" w:color="CCCCCC"/>
-              <w:bottom w:val="single" w:sz="1" w:space="0" w:color="CCCCCC"/>
-              <w:right w:val="single" w:sz="1" w:space="0" w:color="CCCCCC"/>
-            </w:tcBorders>
-            <w:shd w:val="clear" w:color="auto" w:fill="FFFFFF"/>
-            <w:tcMar>
-              <w:top w:w="80" w:type="dxa"/>
-              <w:left w:w="120" w:type="dxa"/>
-              <w:bottom w:w="80" w:type="dxa"/>
-              <w:right w:w="120" w:type="dxa"/>
-            </w:tcMar>
-          </w:tcPr>
-          <w:p>
-            <w:r>
-              <w:rPr>
-                <w:color w:val="000000"/>
-                <w:sz w:val="20"/>
-                <w:szCs w:val="20"/>
-              </w:rPr>
-              <w:t>The top-level directory of a storage volume, e.g., C:\.</w:t>
-            </w:r>
-          </w:p>
-        </w:tc>
-      </w:tr>
-      <w:tr>
-        <w:tblPrEx>
-          <w:tblCellMar>
-            <w:top w:w="0" w:type="dxa"/>
-            <w:bottom w:w="0" w:type="dxa"/>
-          </w:tblCellMar>
-        </w:tblPrEx>
-        <w:tc>
-          <w:tcPr>
-            <w:tcW w:w="2400" w:type="dxa"/>
-            <w:tcBorders>
-              <w:top w:val="single" w:sz="1" w:space="0" w:color="CCCCCC"/>
-              <w:left w:val="single" w:sz="1" w:space="0" w:color="CCCCCC"/>
-              <w:bottom w:val="single" w:sz="1" w:space="0" w:color="CCCCCC"/>
-              <w:right w:val="single" w:sz="1" w:space="0" w:color="CCCCCC"/>
-            </w:tcBorders>
-            <w:shd w:val="clear" w:color="auto" w:fill="FFFFFF"/>
-            <w:tcMar>
-              <w:top w:w="80" w:type="dxa"/>
-              <w:left w:w="120" w:type="dxa"/>
-              <w:bottom w:w="80" w:type="dxa"/>
-              <w:right w:w="120" w:type="dxa"/>
-            </w:tcMar>
-          </w:tcPr>
-          <w:p>
-            <w:r>
-              <w:rPr>
-                <w:b/>
-                <w:bCs/>
-                <w:color w:val="2E75B6"/>
-                <w:sz w:val="20"/>
-                <w:szCs w:val="20"/>
-              </w:rPr>
-              <w:t>Filter</w:t>
-            </w:r>
-          </w:p>
-        </w:tc>
-        <w:tc>
-          <w:tcPr>
-            <w:tcW w:w="6960" w:type="dxa"/>
-            <w:tcBorders>
-              <w:top w:val="single" w:sz="1" w:space="0" w:color="CCCCCC"/>
-              <w:left w:val="single" w:sz="1" w:space="0" w:color="CCCCCC"/>
-              <w:bottom w:val="single" w:sz="1" w:space="0" w:color="CCCCCC"/>
-              <w:right w:val="single" w:sz="1" w:space="0" w:color="CCCCCC"/>
-            </w:tcBorders>
-            <w:shd w:val="clear" w:color="auto" w:fill="FFFFFF"/>
-            <w:tcMar>
-              <w:top w:w="80" w:type="dxa"/>
-              <w:left w:w="120" w:type="dxa"/>
-              <w:bottom w:w="80" w:type="dxa"/>
-              <w:right w:w="120" w:type="dxa"/>
-            </w:tcMar>
-          </w:tcPr>
-          <w:p>
-            <w:r>
-              <w:rPr>
-                <w:color w:val="000000"/>
-                <w:sz w:val="20"/>
-                <w:szCs w:val="20"/>
-              </w:rPr>
-              <w:t>A wildcard pattern (or semicolon-separated list of patterns) entered in the toolbar Filter box that restricts which files are shown in the file list.</w:t>
-            </w:r>
-          </w:p>
-        </w:tc>
-      </w:tr>
-      <w:tr>
-        <w:tblPrEx>
-          <w:tblCellMar>
-            <w:top w:w="0" w:type="dxa"/>
-            <w:bottom w:w="0" w:type="dxa"/>
-          </w:tblCellMar>
-        </w:tblPrEx>
-        <w:tc>
-          <w:tcPr>
-            <w:tcW w:w="2400" w:type="dxa"/>
-            <w:tcBorders>
-              <w:top w:val="single" w:sz="1" w:space="0" w:color="CCCCCC"/>
-              <w:left w:val="single" w:sz="1" w:space="0" w:color="CCCCCC"/>
-              <w:bottom w:val="single" w:sz="1" w:space="0" w:color="CCCCCC"/>
-              <w:right w:val="single" w:sz="1" w:space="0" w:color="CCCCCC"/>
-            </w:tcBorders>
-            <w:shd w:val="clear" w:color="auto" w:fill="FFFFFF"/>
-            <w:tcMar>
-              <w:top w:w="80" w:type="dxa"/>
-              <w:left w:w="120" w:type="dxa"/>
-              <w:bottom w:w="80" w:type="dxa"/>
-              <w:right w:w="120" w:type="dxa"/>
-            </w:tcMar>
-          </w:tcPr>
-          <w:p>
-            <w:r>
-              <w:rPr>
-                <w:b/>
-                <w:bCs/>
-                <w:color w:val="2E75B6"/>
-                <w:sz w:val="20"/>
-                <w:szCs w:val="20"/>
-              </w:rPr>
-              <w:t>Framework-Dependent</w:t>
-            </w:r>
-          </w:p>
-        </w:tc>
-        <w:tc>
-          <w:tcPr>
-            <w:tcW w:w="6960" w:type="dxa"/>
-            <w:tcBorders>
-              <w:top w:val="single" w:sz="1" w:space="0" w:color="CCCCCC"/>
-              <w:left w:val="single" w:sz="1" w:space="0" w:color="CCCCCC"/>
-              <w:bottom w:val="single" w:sz="1" w:space="0" w:color="CCCCCC"/>
-              <w:right w:val="single" w:sz="1" w:space="0" w:color="CCCCCC"/>
-            </w:tcBorders>
-            <w:shd w:val="clear" w:color="auto" w:fill="FFFFFF"/>
-            <w:tcMar>
-              <w:top w:w="80" w:type="dxa"/>
-              <w:left w:w="120" w:type="dxa"/>
-              <w:bottom w:w="80" w:type="dxa"/>
-              <w:right w:w="120" w:type="dxa"/>
-            </w:tcMar>
-          </w:tcPr>
-          <w:p>
-            <w:r>
-              <w:rPr>
-                <w:color w:val="000000"/>
-                <w:sz w:val="20"/>
-                <w:szCs w:val="20"/>
-              </w:rPr>
-              <w:t>A deployment model where the .NET runtime must be pre-installed on the target machine separately from the application binary.</w:t>
-            </w:r>
-          </w:p>
-        </w:tc>
-      </w:tr>
-      <w:tr>
-        <w:tblPrEx>
-          <w:tblCellMar>
-            <w:top w:w="0" w:type="dxa"/>
-            <w:bottom w:w="0" w:type="dxa"/>
-          </w:tblCellMar>
-        </w:tblPrEx>
-        <w:tc>
-          <w:tcPr>
-            <w:tcW w:w="2400" w:type="dxa"/>
-            <w:tcBorders>
-              <w:top w:val="single" w:sz="1" w:space="0" w:color="CCCCCC"/>
-              <w:left w:val="single" w:sz="1" w:space="0" w:color="CCCCCC"/>
-              <w:bottom w:val="single" w:sz="1" w:space="0" w:color="CCCCCC"/>
-              <w:right w:val="single" w:sz="1" w:space="0" w:color="CCCCCC"/>
-            </w:tcBorders>
-            <w:shd w:val="clear" w:color="auto" w:fill="FFFFFF"/>
-            <w:tcMar>
-              <w:top w:w="80" w:type="dxa"/>
-              <w:left w:w="120" w:type="dxa"/>
-              <w:bottom w:w="80" w:type="dxa"/>
-              <w:right w:w="120" w:type="dxa"/>
-            </w:tcMar>
-          </w:tcPr>
-          <w:p>
-            <w:r>
-              <w:rPr>
-                <w:b/>
-                <w:bCs/>
-                <w:color w:val="2E75B6"/>
-                <w:sz w:val="20"/>
-                <w:szCs w:val="20"/>
-              </w:rPr>
-              <w:t>Self-Contained</w:t>
-            </w:r>
-          </w:p>
-        </w:tc>
-        <w:tc>
-          <w:tcPr>
-            <w:tcW w:w="6960" w:type="dxa"/>
-            <w:tcBorders>
-              <w:top w:val="single" w:sz="1" w:space="0" w:color="CCCCCC"/>
-              <w:left w:val="single" w:sz="1" w:space="0" w:color="CCCCCC"/>
-              <w:bottom w:val="single" w:sz="1" w:space="0" w:color="CCCCCC"/>
-              <w:right w:val="single" w:sz="1" w:space="0" w:color="CCCCCC"/>
-            </w:tcBorders>
-            <w:shd w:val="clear" w:color="auto" w:fill="FFFFFF"/>
-            <w:tcMar>
-              <w:top w:w="80" w:type="dxa"/>
-              <w:left w:w="120" w:type="dxa"/>
-              <w:bottom w:w="80" w:type="dxa"/>
-              <w:right w:w="120" w:type="dxa"/>
-            </w:tcMar>
-          </w:tcPr>
-          <w:p>
-            <w:r>
-              <w:rPr>
-                <w:color w:val="000000"/>
-                <w:sz w:val="20"/>
-                <w:szCs w:val="20"/>
-              </w:rPr>
-              <w:t>A deployment model where the .NET runtime is bundled inside the application executable, requiring no separate runtime installation.</w:t>
-            </w:r>
-          </w:p>
-        </w:tc>
-      </w:tr>
-      <w:tr>
-        <w:tblPrEx>
-          <w:tblCellMar>
-            <w:top w:w="0" w:type="dxa"/>
-            <w:bottom w:w="0" w:type="dxa"/>
-          </w:tblCellMar>
-        </w:tblPrEx>
-        <w:tc>
-          <w:tcPr>
-            <w:tcW w:w="2400" w:type="dxa"/>
-            <w:tcBorders>
-              <w:top w:val="single" w:sz="1" w:space="0" w:color="CCCCCC"/>
-              <w:left w:val="single" w:sz="1" w:space="0" w:color="CCCCCC"/>
-              <w:bottom w:val="single" w:sz="1" w:space="0" w:color="CCCCCC"/>
-              <w:right w:val="single" w:sz="1" w:space="0" w:color="CCCCCC"/>
-            </w:tcBorders>
-            <w:shd w:val="clear" w:color="auto" w:fill="FFFFFF"/>
-            <w:tcMar>
-              <w:top w:w="80" w:type="dxa"/>
-              <w:left w:w="120" w:type="dxa"/>
-              <w:bottom w:w="80" w:type="dxa"/>
-              <w:right w:w="120" w:type="dxa"/>
-            </w:tcMar>
-          </w:tcPr>
-          <w:p>
-            <w:r>
-              <w:rPr>
-                <w:b/>
-                <w:bCs/>
-                <w:color w:val="2E75B6"/>
-                <w:sz w:val="20"/>
-                <w:szCs w:val="20"/>
-              </w:rPr>
-              <w:t>This PC View</w:t>
-            </w:r>
-          </w:p>
-        </w:tc>
-        <w:tc>
-          <w:tcPr>
-            <w:tcW w:w="6960" w:type="dxa"/>
-            <w:tcBorders>
-              <w:top w:val="single" w:sz="1" w:space="0" w:color="CCCCCC"/>
-              <w:left w:val="single" w:sz="1" w:space="0" w:color="CCCCCC"/>
-              <w:bottom w:val="single" w:sz="1" w:space="0" w:color="CCCCCC"/>
-              <w:right w:val="single" w:sz="1" w:space="0" w:color="CCCCCC"/>
-            </w:tcBorders>
-            <w:shd w:val="clear" w:color="auto" w:fill="FFFFFF"/>
-            <w:tcMar>
-              <w:top w:w="80" w:type="dxa"/>
-              <w:left w:w="120" w:type="dxa"/>
-              <w:bottom w:w="80" w:type="dxa"/>
-              <w:right w:w="120" w:type="dxa"/>
-            </w:tcMar>
-          </w:tcPr>
-          <w:p>
-            <w:r>
-              <w:rPr>
-                <w:color w:val="000000"/>
-                <w:sz w:val="20"/>
-                <w:szCs w:val="20"/>
-              </w:rPr>
-              <w:t>A special view in the file list that shows all available drives instead of the contents of a specific folder. Reached by pressing Up from a drive root.</w:t>
-            </w:r>
-          </w:p>
-        </w:tc>
-      </w:tr>
-      <w:tr>
-        <w:tblPrEx>
-          <w:tblCellMar>
-            <w:top w:w="0" w:type="dxa"/>
-            <w:bottom w:w="0" w:type="dxa"/>
-          </w:tblCellMar>
-        </w:tblPrEx>
-        <w:tc>
-          <w:tcPr>
-            <w:tcW w:w="2400" w:type="dxa"/>
-            <w:tcBorders>
-              <w:top w:val="single" w:sz="1" w:space="0" w:color="CCCCCC"/>
-              <w:left w:val="single" w:sz="1" w:space="0" w:color="CCCCCC"/>
-              <w:bottom w:val="single" w:sz="1" w:space="0" w:color="CCCCCC"/>
-              <w:right w:val="single" w:sz="1" w:space="0" w:color="CCCCCC"/>
-            </w:tcBorders>
-            <w:shd w:val="clear" w:color="auto" w:fill="FFFFFF"/>
-            <w:tcMar>
-              <w:top w:w="80" w:type="dxa"/>
-              <w:left w:w="120" w:type="dxa"/>
-              <w:bottom w:w="80" w:type="dxa"/>
-              <w:right w:w="120" w:type="dxa"/>
-            </w:tcMar>
-          </w:tcPr>
-          <w:p>
-            <w:r>
-              <w:rPr>
-                <w:b/>
-                <w:bCs/>
-                <w:color w:val="2E75B6"/>
-                <w:sz w:val="20"/>
-                <w:szCs w:val="20"/>
-              </w:rPr>
-              <w:t>WinForms</w:t>
-            </w:r>
-          </w:p>
-        </w:tc>
-        <w:tc>
-          <w:tcPr>
-            <w:tcW w:w="6960" w:type="dxa"/>
-            <w:tcBorders>
-              <w:top w:val="single" w:sz="1" w:space="0" w:color="CCCCCC"/>
-              <w:left w:val="single" w:sz="1" w:space="0" w:color="CCCCCC"/>
-              <w:bottom w:val="single" w:sz="1" w:space="0" w:color="CCCCCC"/>
-              <w:right w:val="single" w:sz="1" w:space="0" w:color="CCCCCC"/>
-            </w:tcBorders>
-            <w:shd w:val="clear" w:color="auto" w:fill="FFFFFF"/>
-            <w:tcMar>
-              <w:top w:w="80" w:type="dxa"/>
-              <w:left w:w="120" w:type="dxa"/>
-              <w:bottom w:w="80" w:type="dxa"/>
-              <w:right w:w="120" w:type="dxa"/>
-            </w:tcMar>
-          </w:tcPr>
-          <w:p>
-            <w:r>
-              <w:rPr>
-                <w:color w:val="000000"/>
-                <w:sz w:val="20"/>
-                <w:szCs w:val="20"/>
-              </w:rPr>
-              <w:t>Windows Forms. A .NET UI framework for building desktop applications on Windows.</w:t>
-            </w:r>
-          </w:p>
-        </w:tc>
-      </w:tr>
-      <w:tr>
-        <w:tblPrEx>
-          <w:tblCellMar>
-            <w:top w:w="0" w:type="dxa"/>
-            <w:bottom w:w="0" w:type="dxa"/>
-          </w:tblCellMar>
-        </w:tblPrEx>
-        <w:tc>
-          <w:tcPr>
-            <w:tcW w:w="2400" w:type="dxa"/>
-            <w:tcBorders>
-              <w:top w:val="single" w:sz="1" w:space="0" w:color="CCCCCC"/>
-              <w:left w:val="single" w:sz="1" w:space="0" w:color="CCCCCC"/>
-              <w:bottom w:val="single" w:sz="1" w:space="0" w:color="CCCCCC"/>
-              <w:right w:val="single" w:sz="1" w:space="0" w:color="CCCCCC"/>
-            </w:tcBorders>
-            <w:shd w:val="clear" w:color="auto" w:fill="FFFFFF"/>
-            <w:tcMar>
-              <w:top w:w="80" w:type="dxa"/>
-              <w:left w:w="120" w:type="dxa"/>
-              <w:bottom w:w="80" w:type="dxa"/>
-              <w:right w:w="120" w:type="dxa"/>
-            </w:tcMar>
-          </w:tcPr>
-          <w:p>
-            <w:r>
-              <w:rPr>
-                <w:b/>
-                <w:bCs/>
-                <w:color w:val="2E75B6"/>
-                <w:sz w:val="20"/>
-                <w:szCs w:val="20"/>
-              </w:rPr>
-              <w:t>Wildcard</w:t>
-            </w:r>
-          </w:p>
-        </w:tc>
-        <w:tc>
-          <w:tcPr>
-            <w:tcW w:w="6960" w:type="dxa"/>
-            <w:tcBorders>
-              <w:top w:val="single" w:sz="1" w:space="0" w:color="CCCCCC"/>
-              <w:left w:val="single" w:sz="1" w:space="0" w:color="CCCCCC"/>
-              <w:bottom w:val="single" w:sz="1" w:space="0" w:color="CCCCCC"/>
-              <w:right w:val="single" w:sz="1" w:space="0" w:color="CCCCCC"/>
-            </w:tcBorders>
-            <w:shd w:val="clear" w:color="auto" w:fill="FFFFFF"/>
-            <w:tcMar>
-              <w:top w:w="80" w:type="dxa"/>
-              <w:left w:w="120" w:type="dxa"/>
-              <w:bottom w:w="80" w:type="dxa"/>
-              <w:right w:w="120" w:type="dxa"/>
-            </w:tcMar>
-          </w:tcPr>
-          <w:p>
-            <w:r>
-              <w:rPr>
-                <w:color w:val="000000"/>
-                <w:sz w:val="20"/>
-                <w:szCs w:val="20"/>
-              </w:rPr>
-              <w:t>A special character used in a filter pattern: * matches zero or more characters; ? matches exactly one character.</w:t>
-            </w:r>
-          </w:p>
-        </w:tc>
-      </w:tr>
-      <w:tr>
-        <w:tblPrEx>
-          <w:tblCellMar>
-            <w:top w:w="0" w:type="dxa"/>
-            <w:bottom w:w="0" w:type="dxa"/>
-          </w:tblCellMar>
-        </w:tblPrEx>
-        <w:tc>
-          <w:tcPr>
-            <w:tcW w:w="2400" w:type="dxa"/>
-            <w:tcBorders>
-              <w:top w:val="single" w:sz="1" w:space="0" w:color="CCCCCC"/>
-              <w:left w:val="single" w:sz="1" w:space="0" w:color="CCCCCC"/>
-              <w:bottom w:val="single" w:sz="1" w:space="0" w:color="CCCCCC"/>
-              <w:right w:val="single" w:sz="1" w:space="0" w:color="CCCCCC"/>
-            </w:tcBorders>
-            <w:shd w:val="clear" w:color="auto" w:fill="FFFFFF"/>
-            <w:tcMar>
-              <w:top w:w="80" w:type="dxa"/>
-              <w:left w:w="120" w:type="dxa"/>
-              <w:bottom w:w="80" w:type="dxa"/>
-              <w:right w:w="120" w:type="dxa"/>
-            </w:tcMar>
-          </w:tcPr>
-          <w:p>
-            <w:r>
-              <w:rPr>
-                <w:b/>
-                <w:bCs/>
-                <w:color w:val="2E75B6"/>
-                <w:sz w:val="20"/>
-                <w:szCs w:val="20"/>
-              </w:rPr>
-              <w:t>Settings File</w:t>
-            </w:r>
-          </w:p>
-        </w:tc>
-        <w:tc>
-          <w:tcPr>
-            <w:tcW w:w="6960" w:type="dxa"/>
-            <w:tcBorders>
-              <w:top w:val="single" w:sz="1" w:space="0" w:color="CCCCCC"/>
-              <w:left w:val="single" w:sz="1" w:space="0" w:color="CCCCCC"/>
-              <w:bottom w:val="single" w:sz="1" w:space="0" w:color="CCCCCC"/>
-              <w:right w:val="single" w:sz="1" w:space="0" w:color="CCCCCC"/>
-            </w:tcBorders>
-            <w:shd w:val="clear" w:color="auto" w:fill="FFFFFF"/>
-            <w:tcMar>
-              <w:top w:w="80" w:type="dxa"/>
-              <w:left w:w="120" w:type="dxa"/>
-              <w:bottom w:w="80" w:type="dxa"/>
-              <w:right w:w="120" w:type="dxa"/>
-            </w:tcMar>
-          </w:tcPr>
-          <w:p>
-            <w:r>
-              <w:rPr>
-                <w:color w:val="000000"/>
-                <w:sz w:val="20"/>
-                <w:szCs w:val="20"/>
-              </w:rPr>
-              <w:t>A JSON file (settings.json) stored in the application directory that persists user preferences between sessions.</w:t>
-            </w:r>
-          </w:p>
-        </w:tc>
-      </w:tr>
-    </w:tbl>
     <w:p>
       <w:pPr>
         <w:spacing w:after="120"/>
@@ -10944,64 +10490,10 @@
 <file path=word/numbering.xml><?xml version="1.0" encoding="utf-8"?>
 <w:numbering xmlns:wpc="http://schemas.microsoft.com/office/word/2010/wordprocessingCanvas" xmlns:cx="http://schemas.microsoft.com/office/drawing/2014/chartex" xmlns:cx1="http://schemas.microsoft.com/office/drawing/2015/9/8/chartex" xmlns:cx2="http://schemas.microsoft.com/office/drawing/2015/10/21/chartex" xmlns:cx3="http://schemas.microsoft.com/office/drawing/2016/5/9/chartex" xmlns:cx4="http://schemas.microsoft.com/office/drawing/2016/5/10/chartex" xmlns:cx5="http://schemas.microsoft.com/office/drawing/2016/5/11/chartex" xmlns:cx6="http://schemas.microsoft.com/office/drawing/2016/5/12/chartex" xmlns:cx7="http://schemas.microsoft.com/office/drawing/2016/5/13/chartex" xmlns:cx8="http://schemas.microsoft.com/office/drawing/2016/5/14/chartex" xmlns:mc="http://schemas.openxmlformats.org/markup-compatibility/2006" xmlns:aink="http://schemas.microsoft.com/office/drawing/2016/ink" xmlns:am3d="http://schemas.microsoft.com/office/drawing/2017/model3d" xmlns:o="urn:schemas-microsoft-com:office:office" xmlns:oel="http://schemas.microsoft.com/office/2019/extlst" xmlns:r="http://schemas.openxmlformats.org/officeDocument/2006/relationships" xmlns:m="http://schemas.openxmlformats.org/officeDocument/2006/math" xmlns:v="urn:schemas-microsoft-com:vml" xmlns:wp14="http://schemas.microsoft.com/office/word/2010/wordprocessingDrawing" xmlns:wp="http://schemas.openxmlformats.org/drawingml/2006/wordprocessingDrawing" xmlns:w10="urn:schemas-microsoft-com:office:word" xmlns:w="http://schemas.openxmlformats.org/wordprocessingml/2006/main" xmlns:w14="http://schemas.microsoft.com/office/word/2010/wordml" xmlns:w15="http://schemas.microsoft.com/office/word/2012/wordml" xmlns:w16cex="http://schemas.microsoft.com/office/word/2018/wordml/cex" xmlns:w16cid="http://schemas.microsoft.com/office/word/2016/wordml/cid" xmlns:w16="http://schemas.microsoft.com/office/word/2018/wordml" xmlns:w16du="http://schemas.microsoft.com/office/word/2023/wordml/word16du" xmlns:w16sdtdh="http://schemas.microsoft.com/office/word/2020/wordml/sdtdatahash" xmlns:w16sdtfl="http://schemas.microsoft.com/office/word/2024/wordml/sdtformatlock" xmlns:w16se="http://schemas.microsoft.com/office/word/2015/wordml/symex" xmlns:wpg="http://schemas.microsoft.com/office/word/2010/wordprocessingGroup" xmlns:wpi="http://schemas.microsoft.com/office/word/2010/wordprocessingInk" xmlns:wne="http://schemas.microsoft.com/office/word/2006/wordml" xmlns:wps="http://schemas.microsoft.com/office/word/2010/wordprocessingShape" mc:Ignorable="w14 w15 w16se w16cid w16 w16cex w16sdtdh w16sdtfl w16du wp14">
   <w:abstractNum w:abstractNumId="0" w15:restartNumberingAfterBreak="0">
-    <w:nsid w:val="08247600"/>
+    <w:nsid w:val="44C616F1"/>
     <w:multiLevelType w:val="hybridMultilevel"/>
-    <w:tmpl w:val="7C5C448A"/>
-    <w:lvl w:ilvl="0" w:tplc="F95CC9FC">
-      <w:start w:val="1"/>
-      <w:numFmt w:val="bullet"/>
-      <w:lvlText w:val="•"/>
-      <w:lvlJc w:val="left"/>
-      <w:pPr>
-        <w:ind w:left="720" w:hanging="360"/>
-      </w:pPr>
-    </w:lvl>
-    <w:lvl w:ilvl="1" w:tplc="8440F6A8">
-      <w:numFmt w:val="decimal"/>
-      <w:lvlText w:val=""/>
-      <w:lvlJc w:val="left"/>
-    </w:lvl>
-    <w:lvl w:ilvl="2" w:tplc="2DE632C6">
-      <w:numFmt w:val="decimal"/>
-      <w:lvlText w:val=""/>
-      <w:lvlJc w:val="left"/>
-    </w:lvl>
-    <w:lvl w:ilvl="3" w:tplc="241CBF70">
-      <w:numFmt w:val="decimal"/>
-      <w:lvlText w:val=""/>
-      <w:lvlJc w:val="left"/>
-    </w:lvl>
-    <w:lvl w:ilvl="4" w:tplc="E4EA9096">
-      <w:numFmt w:val="decimal"/>
-      <w:lvlText w:val=""/>
-      <w:lvlJc w:val="left"/>
-    </w:lvl>
-    <w:lvl w:ilvl="5" w:tplc="395844E0">
-      <w:numFmt w:val="decimal"/>
-      <w:lvlText w:val=""/>
-      <w:lvlJc w:val="left"/>
-    </w:lvl>
-    <w:lvl w:ilvl="6" w:tplc="A516BFDE">
-      <w:numFmt w:val="decimal"/>
-      <w:lvlText w:val=""/>
-      <w:lvlJc w:val="left"/>
-    </w:lvl>
-    <w:lvl w:ilvl="7" w:tplc="4FA6F51A">
-      <w:numFmt w:val="decimal"/>
-      <w:lvlText w:val=""/>
-      <w:lvlJc w:val="left"/>
-    </w:lvl>
-    <w:lvl w:ilvl="8" w:tplc="83A86790">
-      <w:numFmt w:val="decimal"/>
-      <w:lvlText w:val=""/>
-      <w:lvlJc w:val="left"/>
-    </w:lvl>
-  </w:abstractNum>
-  <w:abstractNum w:abstractNumId="1" w15:restartNumberingAfterBreak="0">
-    <w:nsid w:val="4BC62BB4"/>
-    <w:multiLevelType w:val="hybridMultilevel"/>
-    <w:tmpl w:val="DFF8A784"/>
-    <w:lvl w:ilvl="0" w:tplc="F8D83B8E">
+    <w:tmpl w:val="791ED12E"/>
+    <w:lvl w:ilvl="0" w:tplc="6E24D008">
       <w:start w:val="1"/>
       <w:numFmt w:val="bullet"/>
       <w:lvlText w:val="●"/>
@@ -11010,7 +10502,7 @@
         <w:ind w:left="720" w:hanging="360"/>
       </w:pPr>
     </w:lvl>
-    <w:lvl w:ilvl="1" w:tplc="2A880DBE">
+    <w:lvl w:ilvl="1" w:tplc="74B01F8E">
       <w:start w:val="1"/>
       <w:numFmt w:val="bullet"/>
       <w:lvlText w:val="○"/>
@@ -11019,7 +10511,7 @@
         <w:ind w:left="1440" w:hanging="360"/>
       </w:pPr>
     </w:lvl>
-    <w:lvl w:ilvl="2" w:tplc="B1AEE90A">
+    <w:lvl w:ilvl="2" w:tplc="DB54BFC0">
       <w:start w:val="1"/>
       <w:numFmt w:val="bullet"/>
       <w:lvlText w:val="■"/>
@@ -11028,7 +10520,7 @@
         <w:ind w:left="2160" w:hanging="360"/>
       </w:pPr>
     </w:lvl>
-    <w:lvl w:ilvl="3" w:tplc="E1700050">
+    <w:lvl w:ilvl="3" w:tplc="E28226FC">
       <w:start w:val="1"/>
       <w:numFmt w:val="bullet"/>
       <w:lvlText w:val="●"/>
@@ -11037,7 +10529,7 @@
         <w:ind w:left="2880" w:hanging="360"/>
       </w:pPr>
     </w:lvl>
-    <w:lvl w:ilvl="4" w:tplc="567C383A">
+    <w:lvl w:ilvl="4" w:tplc="F3FA5C92">
       <w:start w:val="1"/>
       <w:numFmt w:val="bullet"/>
       <w:lvlText w:val="○"/>
@@ -11046,7 +10538,7 @@
         <w:ind w:left="3600" w:hanging="360"/>
       </w:pPr>
     </w:lvl>
-    <w:lvl w:ilvl="5" w:tplc="58680748">
+    <w:lvl w:ilvl="5" w:tplc="CCE2731E">
       <w:start w:val="1"/>
       <w:numFmt w:val="bullet"/>
       <w:lvlText w:val="■"/>
@@ -11055,7 +10547,7 @@
         <w:ind w:left="4320" w:hanging="360"/>
       </w:pPr>
     </w:lvl>
-    <w:lvl w:ilvl="6" w:tplc="CEE6E7BC">
+    <w:lvl w:ilvl="6" w:tplc="C3F04EAC">
       <w:start w:val="1"/>
       <w:numFmt w:val="bullet"/>
       <w:lvlText w:val="●"/>
@@ -11064,7 +10556,7 @@
         <w:ind w:left="5040" w:hanging="360"/>
       </w:pPr>
     </w:lvl>
-    <w:lvl w:ilvl="7" w:tplc="A900CF0C">
+    <w:lvl w:ilvl="7" w:tplc="B088E17E">
       <w:start w:val="1"/>
       <w:numFmt w:val="bullet"/>
       <w:lvlText w:val="●"/>
@@ -11073,7 +10565,7 @@
         <w:ind w:left="5760" w:hanging="360"/>
       </w:pPr>
     </w:lvl>
-    <w:lvl w:ilvl="8" w:tplc="A0D20C22">
+    <w:lvl w:ilvl="8" w:tplc="478E7A16">
       <w:start w:val="1"/>
       <w:numFmt w:val="bullet"/>
       <w:lvlText w:val="●"/>
@@ -11083,14 +10575,68 @@
       </w:pPr>
     </w:lvl>
   </w:abstractNum>
-  <w:num w:numId="1" w16cid:durableId="420418296">
-    <w:abstractNumId w:val="1"/>
+  <w:abstractNum w:abstractNumId="1" w15:restartNumberingAfterBreak="0">
+    <w:nsid w:val="5D0A17AB"/>
+    <w:multiLevelType w:val="hybridMultilevel"/>
+    <w:tmpl w:val="5F92B9F4"/>
+    <w:lvl w:ilvl="0" w:tplc="7BEC7A90">
+      <w:start w:val="1"/>
+      <w:numFmt w:val="bullet"/>
+      <w:lvlText w:val="•"/>
+      <w:lvlJc w:val="left"/>
+      <w:pPr>
+        <w:ind w:left="720" w:hanging="360"/>
+      </w:pPr>
+    </w:lvl>
+    <w:lvl w:ilvl="1" w:tplc="5C046DFE">
+      <w:numFmt w:val="decimal"/>
+      <w:lvlText w:val=""/>
+      <w:lvlJc w:val="left"/>
+    </w:lvl>
+    <w:lvl w:ilvl="2" w:tplc="1ADA9FF0">
+      <w:numFmt w:val="decimal"/>
+      <w:lvlText w:val=""/>
+      <w:lvlJc w:val="left"/>
+    </w:lvl>
+    <w:lvl w:ilvl="3" w:tplc="510E02EA">
+      <w:numFmt w:val="decimal"/>
+      <w:lvlText w:val=""/>
+      <w:lvlJc w:val="left"/>
+    </w:lvl>
+    <w:lvl w:ilvl="4" w:tplc="4B6E2B02">
+      <w:numFmt w:val="decimal"/>
+      <w:lvlText w:val=""/>
+      <w:lvlJc w:val="left"/>
+    </w:lvl>
+    <w:lvl w:ilvl="5" w:tplc="5E80B786">
+      <w:numFmt w:val="decimal"/>
+      <w:lvlText w:val=""/>
+      <w:lvlJc w:val="left"/>
+    </w:lvl>
+    <w:lvl w:ilvl="6" w:tplc="35CC2A62">
+      <w:numFmt w:val="decimal"/>
+      <w:lvlText w:val=""/>
+      <w:lvlJc w:val="left"/>
+    </w:lvl>
+    <w:lvl w:ilvl="7" w:tplc="5FF21B70">
+      <w:numFmt w:val="decimal"/>
+      <w:lvlText w:val=""/>
+      <w:lvlJc w:val="left"/>
+    </w:lvl>
+    <w:lvl w:ilvl="8" w:tplc="E00E262E">
+      <w:numFmt w:val="decimal"/>
+      <w:lvlText w:val=""/>
+      <w:lvlJc w:val="left"/>
+    </w:lvl>
+  </w:abstractNum>
+  <w:num w:numId="1" w16cid:durableId="1326787472">
+    <w:abstractNumId w:val="0"/>
     <w:lvlOverride w:ilvl="0">
       <w:startOverride w:val="1"/>
     </w:lvlOverride>
   </w:num>
-  <w:num w:numId="2" w16cid:durableId="206526487">
-    <w:abstractNumId w:val="0"/>
+  <w:num w:numId="2" w16cid:durableId="1603223586">
+    <w:abstractNumId w:val="1"/>
     <w:lvlOverride w:ilvl="0">
       <w:startOverride w:val="1"/>
     </w:lvlOverride>
@@ -11708,7 +11254,7 @@
     <w:autoRedefine/>
     <w:uiPriority w:val="39"/>
     <w:unhideWhenUsed/>
-    <w:rsid w:val="00DF23C1"/>
+    <w:rsid w:val="00885558"/>
     <w:pPr>
       <w:spacing w:after="100"/>
     </w:pPr>
@@ -11720,7 +11266,7 @@
     <w:autoRedefine/>
     <w:uiPriority w:val="39"/>
     <w:unhideWhenUsed/>
-    <w:rsid w:val="00DF23C1"/>
+    <w:rsid w:val="00885558"/>
     <w:pPr>
       <w:spacing w:after="100"/>
       <w:ind w:left="220"/>

</xml_diff>